<commit_message>
updated deliverables and fixed code to match deliverable
</commit_message>
<xml_diff>
--- a/Deliverables/Deliverable 1- Project Proposal & Requirements Specification by Ryan Beikrasouli.docx
+++ b/Deliverables/Deliverable 1- Project Proposal & Requirements Specification by Ryan Beikrasouli.docx
@@ -283,27 +283,33 @@
         <w:rPr>
           <w:rFonts w:ascii="Consolas" w:hAnsi="Consolas" w:cs="Consolas"/>
         </w:rPr>
-        <w:t xml:space="preserve">My game features will be made achievable </w:t>
+        <w:t>My game features will be made achievable through the use of modul</w:t>
+      </w:r>
+      <w:r>
+        <w:rPr>
+          <w:rFonts w:ascii="Consolas" w:hAnsi="Consolas" w:cs="Consolas"/>
+        </w:rPr>
+        <w:t xml:space="preserve">arisation and </w:t>
       </w:r>
       <w:proofErr w:type="gramStart"/>
       <w:r>
         <w:rPr>
           <w:rFonts w:ascii="Consolas" w:hAnsi="Consolas" w:cs="Consolas"/>
         </w:rPr>
-        <w:t>through the use of</w:t>
+        <w:t>object oriented</w:t>
       </w:r>
       <w:proofErr w:type="gramEnd"/>
       <w:r>
         <w:rPr>
           <w:rFonts w:ascii="Consolas" w:hAnsi="Consolas" w:cs="Consolas"/>
         </w:rPr>
-        <w:t xml:space="preserve"> modul</w:t>
+        <w:t xml:space="preserve"> programming practices</w:t>
       </w:r>
       <w:r>
         <w:rPr>
           <w:rFonts w:ascii="Consolas" w:hAnsi="Consolas" w:cs="Consolas"/>
         </w:rPr>
-        <w:t xml:space="preserve">arisation and OOP. </w:t>
+        <w:t xml:space="preserve">. </w:t>
       </w:r>
       <w:r>
         <w:rPr>
@@ -383,7 +389,19 @@
         <w:rPr>
           <w:rFonts w:ascii="Consolas" w:hAnsi="Consolas" w:cs="Consolas"/>
         </w:rPr>
-        <w:t>aged between teenager to young adults.</w:t>
+        <w:t>aged between teenager to young adults</w:t>
+      </w:r>
+      <w:r>
+        <w:rPr>
+          <w:rFonts w:ascii="Consolas" w:hAnsi="Consolas" w:cs="Consolas"/>
+        </w:rPr>
+        <w:t xml:space="preserve"> so it would be reasonable to ensure that player base enjoys my created game</w:t>
+      </w:r>
+      <w:r>
+        <w:rPr>
+          <w:rFonts w:ascii="Consolas" w:hAnsi="Consolas" w:cs="Consolas"/>
+        </w:rPr>
+        <w:t>.</w:t>
       </w:r>
     </w:p>
     <w:p>
@@ -629,7 +647,39 @@
         <w:rPr>
           <w:rFonts w:ascii="Consolas" w:hAnsi="Consolas" w:cs="Consolas"/>
         </w:rPr>
-        <w:t>I must create a path finding ‘AI’ for the monsters which would allow them to navigate any map I make without having to manually set the paths for every map I create</w:t>
+        <w:t xml:space="preserve">I must create a </w:t>
+      </w:r>
+      <w:r>
+        <w:rPr>
+          <w:rFonts w:ascii="Consolas" w:hAnsi="Consolas" w:cs="Consolas"/>
+        </w:rPr>
+        <w:t xml:space="preserve">method </w:t>
+      </w:r>
+      <w:r>
+        <w:rPr>
+          <w:rFonts w:ascii="Consolas" w:hAnsi="Consolas" w:cs="Consolas"/>
+        </w:rPr>
+        <w:t xml:space="preserve">for the monsters which would allow them to navigate </w:t>
+      </w:r>
+      <w:r>
+        <w:rPr>
+          <w:rFonts w:ascii="Consolas" w:hAnsi="Consolas" w:cs="Consolas"/>
+        </w:rPr>
+        <w:t xml:space="preserve">the maps I make without having to give the exact x/y coordinates every time. This is achievable </w:t>
+      </w:r>
+      <w:proofErr w:type="gramStart"/>
+      <w:r>
+        <w:rPr>
+          <w:rFonts w:ascii="Consolas" w:hAnsi="Consolas" w:cs="Consolas"/>
+        </w:rPr>
+        <w:t>through the use of</w:t>
+      </w:r>
+      <w:proofErr w:type="gramEnd"/>
+      <w:r>
+        <w:rPr>
+          <w:rFonts w:ascii="Consolas" w:hAnsi="Consolas" w:cs="Consolas"/>
+        </w:rPr>
+        <w:t xml:space="preserve"> waypoints added to the map thanks to the Tiled application which I decided to use to help assist me with the map creation.</w:t>
       </w:r>
     </w:p>
     <w:p>
@@ -780,6 +830,24 @@
         </w:rPr>
         <w:t>The player must be able to upgrade turrets</w:t>
       </w:r>
+      <w:r>
+        <w:rPr>
+          <w:rFonts w:ascii="Consolas" w:hAnsi="Consolas" w:cs="Consolas"/>
+        </w:rPr>
+        <w:t xml:space="preserve"> which would boost their stats such as damage, range and </w:t>
+      </w:r>
+      <w:r>
+        <w:rPr>
+          <w:rFonts w:ascii="Consolas" w:hAnsi="Consolas" w:cs="Consolas"/>
+        </w:rPr>
+        <w:t>attack speed</w:t>
+      </w:r>
+      <w:r>
+        <w:rPr>
+          <w:rFonts w:ascii="Consolas" w:hAnsi="Consolas" w:cs="Consolas"/>
+        </w:rPr>
+        <w:t>.</w:t>
+      </w:r>
     </w:p>
     <w:p>
       <w:pPr>
@@ -803,7 +871,19 @@
         <w:rPr>
           <w:rFonts w:ascii="Consolas" w:hAnsi="Consolas" w:cs="Consolas"/>
         </w:rPr>
-        <w:t>Killing monsters must give the player some income which can be used to buy or upgrade their turrets</w:t>
+        <w:t>Killing monsters</w:t>
+      </w:r>
+      <w:r>
+        <w:rPr>
+          <w:rFonts w:ascii="Consolas" w:hAnsi="Consolas" w:cs="Consolas"/>
+        </w:rPr>
+        <w:t xml:space="preserve"> and finishing waves</w:t>
+      </w:r>
+      <w:r>
+        <w:rPr>
+          <w:rFonts w:ascii="Consolas" w:hAnsi="Consolas" w:cs="Consolas"/>
+        </w:rPr>
+        <w:t xml:space="preserve"> must give the player some income which can be used to buy or upgrade their turrets</w:t>
       </w:r>
     </w:p>
     <w:p>
@@ -981,46 +1061,6 @@
     </w:p>
     <w:p>
       <w:pPr>
-        <w:pStyle w:val="ListParagraph"/>
-        <w:rPr>
-          <w:rFonts w:ascii="Consolas" w:hAnsi="Consolas" w:cs="Consolas"/>
-        </w:rPr>
-      </w:pPr>
-    </w:p>
-    <w:p>
-      <w:pPr>
-        <w:pStyle w:val="ListParagraph"/>
-        <w:rPr>
-          <w:rFonts w:ascii="Consolas" w:hAnsi="Consolas" w:cs="Consolas"/>
-        </w:rPr>
-      </w:pPr>
-    </w:p>
-    <w:p>
-      <w:pPr>
-        <w:pStyle w:val="ListParagraph"/>
-        <w:rPr>
-          <w:rFonts w:ascii="Consolas" w:hAnsi="Consolas" w:cs="Consolas"/>
-        </w:rPr>
-      </w:pPr>
-    </w:p>
-    <w:p>
-      <w:pPr>
-        <w:pStyle w:val="ListParagraph"/>
-        <w:rPr>
-          <w:rFonts w:ascii="Consolas" w:hAnsi="Consolas" w:cs="Consolas"/>
-        </w:rPr>
-      </w:pPr>
-    </w:p>
-    <w:p>
-      <w:pPr>
-        <w:pStyle w:val="ListParagraph"/>
-        <w:rPr>
-          <w:rFonts w:ascii="Consolas" w:hAnsi="Consolas" w:cs="Consolas"/>
-        </w:rPr>
-      </w:pPr>
-    </w:p>
-    <w:p>
-      <w:pPr>
         <w:rPr>
           <w:rFonts w:ascii="Consolas" w:hAnsi="Consolas" w:cs="Consolas"/>
         </w:rPr>
@@ -1043,6 +1083,7 @@
           <w:rFonts w:ascii="Consolas" w:hAnsi="Consolas" w:cs="Consolas"/>
           <w:u w:val="single"/>
         </w:rPr>
+        <w:lastRenderedPageBreak/>
         <w:t>Initial design</w:t>
       </w:r>
       <w:r>
@@ -1072,13 +1113,13 @@
           <w:u w:val="single"/>
         </w:rPr>
         <w:drawing>
-          <wp:anchor distT="0" distB="0" distL="114300" distR="114300" simplePos="0" relativeHeight="251661312" behindDoc="0" locked="0" layoutInCell="1" allowOverlap="1" wp14:anchorId="676DD817" wp14:editId="1545AAFA">
+          <wp:anchor distT="0" distB="0" distL="114300" distR="114300" simplePos="0" relativeHeight="251661312" behindDoc="0" locked="0" layoutInCell="1" allowOverlap="1" wp14:anchorId="676DD817" wp14:editId="2AC9F883">
             <wp:simplePos x="0" y="0"/>
             <wp:positionH relativeFrom="column">
               <wp:posOffset>-41910</wp:posOffset>
             </wp:positionH>
-            <wp:positionV relativeFrom="page">
-              <wp:posOffset>817811</wp:posOffset>
+            <wp:positionV relativeFrom="paragraph">
+              <wp:posOffset>216535</wp:posOffset>
             </wp:positionV>
             <wp:extent cx="7099300" cy="5008245"/>
             <wp:effectExtent l="0" t="0" r="0" b="0"/>
@@ -1149,16 +1190,16 @@
           <w:u w:val="single"/>
         </w:rPr>
         <w:drawing>
-          <wp:anchor distT="0" distB="0" distL="114300" distR="114300" simplePos="0" relativeHeight="251663360" behindDoc="0" locked="0" layoutInCell="1" allowOverlap="1" wp14:anchorId="6C02E651" wp14:editId="23CCA08A">
+          <wp:anchor distT="0" distB="0" distL="114300" distR="114300" simplePos="0" relativeHeight="251663360" behindDoc="0" locked="0" layoutInCell="1" allowOverlap="1" wp14:anchorId="6C02E651" wp14:editId="214F7430">
             <wp:simplePos x="0" y="0"/>
             <wp:positionH relativeFrom="column">
-              <wp:posOffset>37113</wp:posOffset>
+              <wp:posOffset>-45211</wp:posOffset>
             </wp:positionH>
-            <wp:positionV relativeFrom="page">
-              <wp:posOffset>5866765</wp:posOffset>
+            <wp:positionV relativeFrom="paragraph">
+              <wp:posOffset>5047307</wp:posOffset>
             </wp:positionV>
-            <wp:extent cx="4230370" cy="4307205"/>
-            <wp:effectExtent l="0" t="0" r="0" b="0"/>
+            <wp:extent cx="4028440" cy="4101465"/>
+            <wp:effectExtent l="0" t="0" r="0" b="635"/>
             <wp:wrapSquare wrapText="bothSides"/>
             <wp:docPr id="876906793" name="Picture 3" descr="A screenshot of a video game&#10;&#10;AI-generated content may be incorrect."/>
             <wp:cNvGraphicFramePr>
@@ -1186,7 +1227,7 @@
                   <pic:spPr>
                     <a:xfrm>
                       <a:off x="0" y="0"/>
-                      <a:ext cx="4230370" cy="4307205"/>
+                      <a:ext cx="4028440" cy="4101465"/>
                     </a:xfrm>
                     <a:prstGeom prst="rect">
                       <a:avLst/>
@@ -1399,14 +1440,6 @@
     </w:p>
     <w:p>
       <w:pPr>
-        <w:rPr>
-          <w:rFonts w:ascii="Consolas" w:hAnsi="Consolas" w:cs="Consolas"/>
-          <w:u w:val="single"/>
-        </w:rPr>
-      </w:pPr>
-    </w:p>
-    <w:p>
-      <w:pPr>
         <w:pStyle w:val="ListParagraph"/>
         <w:numPr>
           <w:ilvl w:val="1"/>
@@ -1422,6 +1455,7 @@
           <w:rFonts w:ascii="Consolas" w:hAnsi="Consolas" w:cs="Consolas"/>
           <w:u w:val="single"/>
         </w:rPr>
+        <w:lastRenderedPageBreak/>
         <w:t>Class Diagram:</w:t>
       </w:r>
     </w:p>
@@ -1568,6 +1602,19 @@
               <w:rPr>
                 <w:rFonts w:ascii="Consolas" w:hAnsi="Consolas" w:cs="Consolas"/>
               </w:rPr>
+              <w:t>- Height: int</w:t>
+            </w:r>
+          </w:p>
+          <w:p>
+            <w:pPr>
+              <w:rPr>
+                <w:rFonts w:ascii="Consolas" w:hAnsi="Consolas" w:cs="Consolas"/>
+              </w:rPr>
+            </w:pPr>
+            <w:r>
+              <w:rPr>
+                <w:rFonts w:ascii="Consolas" w:hAnsi="Consolas" w:cs="Consolas"/>
+              </w:rPr>
               <w:t>-</w:t>
             </w:r>
             <w:r>
@@ -1802,6 +1849,19 @@
               <w:rPr>
                 <w:rFonts w:ascii="Consolas" w:hAnsi="Consolas" w:cs="Consolas"/>
               </w:rPr>
+              <w:t>+ active: bool</w:t>
+            </w:r>
+          </w:p>
+          <w:p>
+            <w:pPr>
+              <w:rPr>
+                <w:rFonts w:ascii="Consolas" w:hAnsi="Consolas" w:cs="Consolas"/>
+              </w:rPr>
+            </w:pPr>
+            <w:r>
+              <w:rPr>
+                <w:rFonts w:ascii="Consolas" w:hAnsi="Consolas" w:cs="Consolas"/>
+              </w:rPr>
               <w:t>-</w:t>
             </w:r>
             <w:r>
@@ -2081,16 +2141,28 @@
               </w:rPr>
               <w:t xml:space="preserve">: </w:t>
             </w:r>
+            <w:r>
+              <w:rPr>
+                <w:rFonts w:ascii="Consolas" w:hAnsi="Consolas" w:cs="Consolas"/>
+              </w:rPr>
+              <w:t xml:space="preserve"> </w:t>
+            </w:r>
             <w:proofErr w:type="spellStart"/>
             <w:proofErr w:type="gramStart"/>
             <w:r>
               <w:rPr>
                 <w:rFonts w:ascii="Consolas" w:hAnsi="Consolas" w:cs="Consolas"/>
               </w:rPr>
-              <w:t>pygame.Surface</w:t>
+              <w:t>pygame.surface</w:t>
+            </w:r>
+            <w:proofErr w:type="gramEnd"/>
+            <w:r>
+              <w:rPr>
+                <w:rFonts w:ascii="Consolas" w:hAnsi="Consolas" w:cs="Consolas"/>
+              </w:rPr>
+              <w:t>.Surface</w:t>
             </w:r>
             <w:proofErr w:type="spellEnd"/>
-            <w:proofErr w:type="gramEnd"/>
           </w:p>
           <w:p>
             <w:pPr>
@@ -2123,6 +2195,12 @@
                 <w:rFonts w:ascii="Consolas" w:hAnsi="Consolas" w:cs="Consolas"/>
               </w:rPr>
               <w:t xml:space="preserve">: </w:t>
+            </w:r>
+            <w:r>
+              <w:rPr>
+                <w:rFonts w:ascii="Consolas" w:hAnsi="Consolas" w:cs="Consolas"/>
+              </w:rPr>
+              <w:t xml:space="preserve"> </w:t>
             </w:r>
             <w:proofErr w:type="spellStart"/>
             <w:proofErr w:type="gramStart"/>
@@ -2130,41 +2208,16 @@
               <w:rPr>
                 <w:rFonts w:ascii="Consolas" w:hAnsi="Consolas" w:cs="Consolas"/>
               </w:rPr>
-              <w:t>pygame.Surface</w:t>
+              <w:t>pygame.surface</w:t>
+            </w:r>
+            <w:proofErr w:type="gramEnd"/>
+            <w:r>
+              <w:rPr>
+                <w:rFonts w:ascii="Consolas" w:hAnsi="Consolas" w:cs="Consolas"/>
+              </w:rPr>
+              <w:t>.Surface</w:t>
             </w:r>
             <w:proofErr w:type="spellEnd"/>
-            <w:proofErr w:type="gramEnd"/>
-          </w:p>
-          <w:p>
-            <w:pPr>
-              <w:rPr>
-                <w:rFonts w:ascii="Consolas" w:hAnsi="Consolas" w:cs="Consolas"/>
-              </w:rPr>
-            </w:pPr>
-            <w:r>
-              <w:rPr>
-                <w:rFonts w:ascii="Consolas" w:hAnsi="Consolas" w:cs="Consolas"/>
-              </w:rPr>
-              <w:t>+</w:t>
-            </w:r>
-            <w:r>
-              <w:rPr>
-                <w:rFonts w:ascii="Consolas" w:hAnsi="Consolas" w:cs="Consolas"/>
-              </w:rPr>
-              <w:t xml:space="preserve"> </w:t>
-            </w:r>
-            <w:r>
-              <w:rPr>
-                <w:rFonts w:ascii="Consolas" w:hAnsi="Consolas" w:cs="Consolas"/>
-              </w:rPr>
-              <w:t>active</w:t>
-            </w:r>
-            <w:r>
-              <w:rPr>
-                <w:rFonts w:ascii="Consolas" w:hAnsi="Consolas" w:cs="Consolas"/>
-              </w:rPr>
-              <w:t>: bool</w:t>
-            </w:r>
           </w:p>
           <w:p>
             <w:pPr>
@@ -3179,31 +3232,6 @@
                     <w:rPr>
                       <w:rFonts w:ascii="Consolas" w:hAnsi="Consolas" w:cs="Consolas"/>
                     </w:rPr>
-                    <w:t>+</w:t>
-                  </w:r>
-                  <w:r>
-                    <w:rPr>
-                      <w:rFonts w:ascii="Consolas" w:hAnsi="Consolas" w:cs="Consolas"/>
-                    </w:rPr>
-                    <w:t xml:space="preserve"> data: </w:t>
-                  </w:r>
-                  <w:r>
-                    <w:rPr>
-                      <w:rFonts w:ascii="Consolas" w:hAnsi="Consolas" w:cs="Consolas"/>
-                    </w:rPr>
-                    <w:t>list</w:t>
-                  </w:r>
-                </w:p>
-                <w:p>
-                  <w:pPr>
-                    <w:rPr>
-                      <w:rFonts w:ascii="Consolas" w:hAnsi="Consolas" w:cs="Consolas"/>
-                    </w:rPr>
-                  </w:pPr>
-                  <w:r>
-                    <w:rPr>
-                      <w:rFonts w:ascii="Consolas" w:hAnsi="Consolas" w:cs="Consolas"/>
-                    </w:rPr>
                     <w:t xml:space="preserve">+ </w:t>
                   </w:r>
                   <w:proofErr w:type="spellStart"/>
@@ -3258,7 +3286,13 @@
                     <w:rPr>
                       <w:rFonts w:ascii="Consolas" w:hAnsi="Consolas" w:cs="Consolas"/>
                     </w:rPr>
-                    <w:t>- x</w:t>
+                    <w:t>+</w:t>
+                  </w:r>
+                  <w:r>
+                    <w:rPr>
+                      <w:rFonts w:ascii="Consolas" w:hAnsi="Consolas" w:cs="Consolas"/>
+                    </w:rPr>
+                    <w:t xml:space="preserve"> x</w:t>
                   </w:r>
                   <w:r>
                     <w:rPr>
@@ -3277,13 +3311,32 @@
                     <w:rPr>
                       <w:rFonts w:ascii="Consolas" w:hAnsi="Consolas" w:cs="Consolas"/>
                     </w:rPr>
-                    <w:t>- y</w:t>
+                    <w:t>+</w:t>
                   </w:r>
                   <w:r>
                     <w:rPr>
                       <w:rFonts w:ascii="Consolas" w:hAnsi="Consolas" w:cs="Consolas"/>
                     </w:rPr>
+                    <w:t xml:space="preserve"> y</w:t>
+                  </w:r>
+                  <w:r>
+                    <w:rPr>
+                      <w:rFonts w:ascii="Consolas" w:hAnsi="Consolas" w:cs="Consolas"/>
+                    </w:rPr>
                     <w:t>: int</w:t>
+                  </w:r>
+                </w:p>
+                <w:p>
+                  <w:pPr>
+                    <w:rPr>
+                      <w:rFonts w:ascii="Consolas" w:hAnsi="Consolas" w:cs="Consolas"/>
+                    </w:rPr>
+                  </w:pPr>
+                  <w:r>
+                    <w:rPr>
+                      <w:rFonts w:ascii="Consolas" w:hAnsi="Consolas" w:cs="Consolas"/>
+                    </w:rPr>
+                    <w:t>+ data: list</w:t>
                   </w:r>
                 </w:p>
                 <w:p>
@@ -3466,79 +3519,8 @@
                     <w:rPr>
                       <w:rFonts w:ascii="Consolas" w:hAnsi="Consolas" w:cs="Consolas"/>
                     </w:rPr>
-                    <w:t xml:space="preserve">+ </w:t>
+                    <w:t>+ damage: int</w:t>
                   </w:r>
-                  <w:proofErr w:type="spellStart"/>
-                  <w:r>
-                    <w:rPr>
-                      <w:rFonts w:ascii="Consolas" w:hAnsi="Consolas" w:cs="Consolas"/>
-                    </w:rPr>
-                    <w:t>originalImage</w:t>
-                  </w:r>
-                  <w:proofErr w:type="spellEnd"/>
-                  <w:r>
-                    <w:rPr>
-                      <w:rFonts w:ascii="Consolas" w:hAnsi="Consolas" w:cs="Consolas"/>
-                    </w:rPr>
-                    <w:t xml:space="preserve">: </w:t>
-                  </w:r>
-                  <w:proofErr w:type="spellStart"/>
-                  <w:proofErr w:type="gramStart"/>
-                  <w:r>
-                    <w:rPr>
-                      <w:rFonts w:ascii="Consolas" w:hAnsi="Consolas" w:cs="Consolas"/>
-                    </w:rPr>
-                    <w:t>pygame.surface</w:t>
-                  </w:r>
-                  <w:proofErr w:type="gramEnd"/>
-                  <w:r>
-                    <w:rPr>
-                      <w:rFonts w:ascii="Consolas" w:hAnsi="Consolas" w:cs="Consolas"/>
-                    </w:rPr>
-                    <w:t>.Surface</w:t>
-                  </w:r>
-                  <w:proofErr w:type="spellEnd"/>
-                </w:p>
-                <w:p>
-                  <w:pPr>
-                    <w:rPr>
-                      <w:rFonts w:ascii="Consolas" w:hAnsi="Consolas" w:cs="Consolas"/>
-                    </w:rPr>
-                  </w:pPr>
-                  <w:r>
-                    <w:rPr>
-                      <w:rFonts w:ascii="Consolas" w:hAnsi="Consolas" w:cs="Consolas"/>
-                    </w:rPr>
-                    <w:t xml:space="preserve">- </w:t>
-                  </w:r>
-                  <w:r>
-                    <w:rPr>
-                      <w:rFonts w:ascii="Consolas" w:hAnsi="Consolas" w:cs="Consolas"/>
-                    </w:rPr>
-                    <w:t>image</w:t>
-                  </w:r>
-                  <w:r>
-                    <w:rPr>
-                      <w:rFonts w:ascii="Consolas" w:hAnsi="Consolas" w:cs="Consolas"/>
-                    </w:rPr>
-                    <w:t xml:space="preserve">: </w:t>
-                  </w:r>
-                  <w:proofErr w:type="spellStart"/>
-                  <w:proofErr w:type="gramStart"/>
-                  <w:r>
-                    <w:rPr>
-                      <w:rFonts w:ascii="Consolas" w:hAnsi="Consolas" w:cs="Consolas"/>
-                    </w:rPr>
-                    <w:t>pygame.surface</w:t>
-                  </w:r>
-                  <w:proofErr w:type="gramEnd"/>
-                  <w:r>
-                    <w:rPr>
-                      <w:rFonts w:ascii="Consolas" w:hAnsi="Consolas" w:cs="Consolas"/>
-                    </w:rPr>
-                    <w:t>.Surface</w:t>
-                  </w:r>
-                  <w:proofErr w:type="spellEnd"/>
                 </w:p>
                 <w:p>
                   <w:pPr>
@@ -3557,14 +3539,14 @@
                     <w:rPr>
                       <w:rFonts w:ascii="Consolas" w:hAnsi="Consolas" w:cs="Consolas"/>
                     </w:rPr>
-                    <w:t>speedDoubled</w:t>
+                    <w:t>lastShot</w:t>
                   </w:r>
                   <w:proofErr w:type="spellEnd"/>
                   <w:r>
                     <w:rPr>
                       <w:rFonts w:ascii="Consolas" w:hAnsi="Consolas" w:cs="Consolas"/>
                     </w:rPr>
-                    <w:t>: bool</w:t>
+                    <w:t>: int</w:t>
                   </w:r>
                 </w:p>
               </w:tc>
@@ -3589,6 +3571,339 @@
                     <w:rPr>
                       <w:rFonts w:ascii="Consolas" w:hAnsi="Consolas" w:cs="Consolas"/>
                     </w:rPr>
+                    <w:t>updateTime</w:t>
+                  </w:r>
+                  <w:proofErr w:type="spellEnd"/>
+                  <w:r>
+                    <w:rPr>
+                      <w:rFonts w:ascii="Consolas" w:hAnsi="Consolas" w:cs="Consolas"/>
+                    </w:rPr>
+                    <w:t>: int</w:t>
+                  </w:r>
+                </w:p>
+                <w:p>
+                  <w:pPr>
+                    <w:rPr>
+                      <w:rFonts w:ascii="Consolas" w:hAnsi="Consolas" w:cs="Consolas"/>
+                    </w:rPr>
+                  </w:pPr>
+                  <w:r>
+                    <w:rPr>
+                      <w:rFonts w:ascii="Consolas" w:hAnsi="Consolas" w:cs="Consolas"/>
+                    </w:rPr>
+                    <w:t>+ selected: bool</w:t>
+                  </w:r>
+                </w:p>
+                <w:p>
+                  <w:pPr>
+                    <w:rPr>
+                      <w:rFonts w:ascii="Consolas" w:hAnsi="Consolas" w:cs="Consolas"/>
+                    </w:rPr>
+                  </w:pPr>
+                  <w:r>
+                    <w:rPr>
+                      <w:rFonts w:ascii="Consolas" w:hAnsi="Consolas" w:cs="Consolas"/>
+                    </w:rPr>
+                    <w:t>+</w:t>
+                  </w:r>
+                  <w:r>
+                    <w:rPr>
+                      <w:rFonts w:ascii="Consolas" w:hAnsi="Consolas" w:cs="Consolas"/>
+                    </w:rPr>
+                    <w:t xml:space="preserve"> target: Enemy</w:t>
+                  </w:r>
+                </w:p>
+                <w:p>
+                  <w:pPr>
+                    <w:rPr>
+                      <w:rFonts w:ascii="Consolas" w:hAnsi="Consolas" w:cs="Consolas"/>
+                    </w:rPr>
+                  </w:pPr>
+                  <w:r>
+                    <w:rPr>
+                      <w:rFonts w:ascii="Consolas" w:hAnsi="Consolas" w:cs="Consolas"/>
+                    </w:rPr>
+                    <w:t xml:space="preserve">- </w:t>
+                  </w:r>
+                  <w:proofErr w:type="spellStart"/>
+                  <w:r>
+                    <w:rPr>
+                      <w:rFonts w:ascii="Consolas" w:hAnsi="Consolas" w:cs="Consolas"/>
+                    </w:rPr>
+                    <w:t>doubleSpeed</w:t>
+                  </w:r>
+                  <w:proofErr w:type="spellEnd"/>
+                  <w:r>
+                    <w:rPr>
+                      <w:rFonts w:ascii="Consolas" w:hAnsi="Consolas" w:cs="Consolas"/>
+                    </w:rPr>
+                    <w:t>: bool</w:t>
+                  </w:r>
+                </w:p>
+                <w:p>
+                  <w:pPr>
+                    <w:rPr>
+                      <w:rFonts w:ascii="Consolas" w:hAnsi="Consolas" w:cs="Consolas"/>
+                    </w:rPr>
+                  </w:pPr>
+                  <w:r>
+                    <w:rPr>
+                      <w:rFonts w:ascii="Consolas" w:hAnsi="Consolas" w:cs="Consolas"/>
+                    </w:rPr>
+                    <w:t xml:space="preserve">- </w:t>
+                  </w:r>
+                  <w:proofErr w:type="spellStart"/>
+                  <w:r>
+                    <w:rPr>
+                      <w:rFonts w:ascii="Consolas" w:hAnsi="Consolas" w:cs="Consolas"/>
+                    </w:rPr>
+                    <w:t>upgradeSfx</w:t>
+                  </w:r>
+                  <w:proofErr w:type="spellEnd"/>
+                  <w:r>
+                    <w:rPr>
+                      <w:rFonts w:ascii="Consolas" w:hAnsi="Consolas" w:cs="Consolas"/>
+                    </w:rPr>
+                    <w:t xml:space="preserve">: </w:t>
+                  </w:r>
+                  <w:proofErr w:type="spellStart"/>
+                  <w:proofErr w:type="gramStart"/>
+                  <w:r>
+                    <w:rPr>
+                      <w:rFonts w:ascii="Consolas" w:hAnsi="Consolas" w:cs="Consolas"/>
+                    </w:rPr>
+                    <w:t>pygame.mixer</w:t>
+                  </w:r>
+                  <w:proofErr w:type="gramEnd"/>
+                  <w:r>
+                    <w:rPr>
+                      <w:rFonts w:ascii="Consolas" w:hAnsi="Consolas" w:cs="Consolas"/>
+                    </w:rPr>
+                    <w:t>.Sound</w:t>
+                  </w:r>
+                  <w:proofErr w:type="spellEnd"/>
+                </w:p>
+                <w:p>
+                  <w:pPr>
+                    <w:rPr>
+                      <w:rFonts w:ascii="Consolas" w:hAnsi="Consolas" w:cs="Consolas"/>
+                    </w:rPr>
+                  </w:pPr>
+                  <w:r>
+                    <w:rPr>
+                      <w:rFonts w:ascii="Consolas" w:hAnsi="Consolas" w:cs="Consolas"/>
+                    </w:rPr>
+                    <w:t xml:space="preserve">+ </w:t>
+                  </w:r>
+                  <w:proofErr w:type="spellStart"/>
+                  <w:r>
+                    <w:rPr>
+                      <w:rFonts w:ascii="Consolas" w:hAnsi="Consolas" w:cs="Consolas"/>
+                    </w:rPr>
+                    <w:t>allTurretSheets</w:t>
+                  </w:r>
+                  <w:proofErr w:type="spellEnd"/>
+                  <w:r>
+                    <w:rPr>
+                      <w:rFonts w:ascii="Consolas" w:hAnsi="Consolas" w:cs="Consolas"/>
+                    </w:rPr>
+                    <w:t>: list</w:t>
+                  </w:r>
+                </w:p>
+                <w:p>
+                  <w:pPr>
+                    <w:rPr>
+                      <w:rFonts w:ascii="Consolas" w:hAnsi="Consolas" w:cs="Consolas"/>
+                    </w:rPr>
+                  </w:pPr>
+                  <w:r>
+                    <w:rPr>
+                      <w:rFonts w:ascii="Consolas" w:hAnsi="Consolas" w:cs="Consolas"/>
+                    </w:rPr>
+                    <w:t xml:space="preserve">+ </w:t>
+                  </w:r>
+                  <w:proofErr w:type="spellStart"/>
+                  <w:r>
+                    <w:rPr>
+                      <w:rFonts w:ascii="Consolas" w:hAnsi="Consolas" w:cs="Consolas"/>
+                    </w:rPr>
+                    <w:t>animationImages</w:t>
+                  </w:r>
+                  <w:proofErr w:type="spellEnd"/>
+                  <w:r>
+                    <w:rPr>
+                      <w:rFonts w:ascii="Consolas" w:hAnsi="Consolas" w:cs="Consolas"/>
+                    </w:rPr>
+                    <w:t>: list</w:t>
+                  </w:r>
+                </w:p>
+                <w:p>
+                  <w:pPr>
+                    <w:rPr>
+                      <w:rFonts w:ascii="Consolas" w:hAnsi="Consolas" w:cs="Consolas"/>
+                    </w:rPr>
+                  </w:pPr>
+                  <w:r>
+                    <w:rPr>
+                      <w:rFonts w:ascii="Consolas" w:hAnsi="Consolas" w:cs="Consolas"/>
+                    </w:rPr>
+                    <w:t>+</w:t>
+                  </w:r>
+                  <w:r>
+                    <w:rPr>
+                      <w:rFonts w:ascii="Consolas" w:hAnsi="Consolas" w:cs="Consolas"/>
+                    </w:rPr>
+                    <w:t xml:space="preserve"> </w:t>
+                  </w:r>
+                  <w:proofErr w:type="spellStart"/>
+                  <w:r>
+                    <w:rPr>
+                      <w:rFonts w:ascii="Consolas" w:hAnsi="Consolas" w:cs="Consolas"/>
+                    </w:rPr>
+                    <w:t>imageIndex</w:t>
+                  </w:r>
+                  <w:proofErr w:type="spellEnd"/>
+                  <w:r>
+                    <w:rPr>
+                      <w:rFonts w:ascii="Consolas" w:hAnsi="Consolas" w:cs="Consolas"/>
+                    </w:rPr>
+                    <w:t>: int</w:t>
+                  </w:r>
+                </w:p>
+                <w:p>
+                  <w:pPr>
+                    <w:rPr>
+                      <w:rFonts w:ascii="Consolas" w:hAnsi="Consolas" w:cs="Consolas"/>
+                    </w:rPr>
+                  </w:pPr>
+                  <w:r>
+                    <w:rPr>
+                      <w:rFonts w:ascii="Consolas" w:hAnsi="Consolas" w:cs="Consolas"/>
+                    </w:rPr>
+                    <w:t>+</w:t>
+                  </w:r>
+                  <w:r>
+                    <w:rPr>
+                      <w:rFonts w:ascii="Consolas" w:hAnsi="Consolas" w:cs="Consolas"/>
+                    </w:rPr>
+                    <w:t xml:space="preserve"> </w:t>
+                  </w:r>
+                  <w:proofErr w:type="spellStart"/>
+                  <w:r>
+                    <w:rPr>
+                      <w:rFonts w:ascii="Consolas" w:hAnsi="Consolas" w:cs="Consolas"/>
+                    </w:rPr>
+                    <w:t>rotationAngle</w:t>
+                  </w:r>
+                  <w:proofErr w:type="spellEnd"/>
+                  <w:r>
+                    <w:rPr>
+                      <w:rFonts w:ascii="Consolas" w:hAnsi="Consolas" w:cs="Consolas"/>
+                    </w:rPr>
+                    <w:t>: float | int</w:t>
+                  </w:r>
+                </w:p>
+                <w:p>
+                  <w:pPr>
+                    <w:rPr>
+                      <w:rFonts w:ascii="Consolas" w:hAnsi="Consolas" w:cs="Consolas"/>
+                    </w:rPr>
+                  </w:pPr>
+                  <w:r>
+                    <w:rPr>
+                      <w:rFonts w:ascii="Consolas" w:hAnsi="Consolas" w:cs="Consolas"/>
+                    </w:rPr>
+                    <w:t xml:space="preserve">+ </w:t>
+                  </w:r>
+                  <w:proofErr w:type="spellStart"/>
+                  <w:r>
+                    <w:rPr>
+                      <w:rFonts w:ascii="Consolas" w:hAnsi="Consolas" w:cs="Consolas"/>
+                    </w:rPr>
+                    <w:t>originalImage</w:t>
+                  </w:r>
+                  <w:proofErr w:type="spellEnd"/>
+                  <w:r>
+                    <w:rPr>
+                      <w:rFonts w:ascii="Consolas" w:hAnsi="Consolas" w:cs="Consolas"/>
+                    </w:rPr>
+                    <w:t xml:space="preserve">: </w:t>
+                  </w:r>
+                  <w:proofErr w:type="spellStart"/>
+                  <w:proofErr w:type="gramStart"/>
+                  <w:r>
+                    <w:rPr>
+                      <w:rFonts w:ascii="Consolas" w:hAnsi="Consolas" w:cs="Consolas"/>
+                    </w:rPr>
+                    <w:t>pygame.surface</w:t>
+                  </w:r>
+                  <w:proofErr w:type="gramEnd"/>
+                  <w:r>
+                    <w:rPr>
+                      <w:rFonts w:ascii="Consolas" w:hAnsi="Consolas" w:cs="Consolas"/>
+                    </w:rPr>
+                    <w:t>.Surface</w:t>
+                  </w:r>
+                  <w:proofErr w:type="spellEnd"/>
+                </w:p>
+                <w:p>
+                  <w:pPr>
+                    <w:rPr>
+                      <w:rFonts w:ascii="Consolas" w:hAnsi="Consolas" w:cs="Consolas"/>
+                    </w:rPr>
+                  </w:pPr>
+                  <w:r>
+                    <w:rPr>
+                      <w:rFonts w:ascii="Consolas" w:hAnsi="Consolas" w:cs="Consolas"/>
+                    </w:rPr>
+                    <w:t>+</w:t>
+                  </w:r>
+                  <w:r>
+                    <w:rPr>
+                      <w:rFonts w:ascii="Consolas" w:hAnsi="Consolas" w:cs="Consolas"/>
+                    </w:rPr>
+                    <w:t xml:space="preserve"> image: </w:t>
+                  </w:r>
+                  <w:proofErr w:type="spellStart"/>
+                  <w:proofErr w:type="gramStart"/>
+                  <w:r>
+                    <w:rPr>
+                      <w:rFonts w:ascii="Consolas" w:hAnsi="Consolas" w:cs="Consolas"/>
+                    </w:rPr>
+                    <w:t>pygame.surface</w:t>
+                  </w:r>
+                  <w:proofErr w:type="gramEnd"/>
+                  <w:r>
+                    <w:rPr>
+                      <w:rFonts w:ascii="Consolas" w:hAnsi="Consolas" w:cs="Consolas"/>
+                    </w:rPr>
+                    <w:t>.Surface</w:t>
+                  </w:r>
+                  <w:proofErr w:type="spellEnd"/>
+                </w:p>
+                <w:p>
+                  <w:pPr>
+                    <w:rPr>
+                      <w:rFonts w:ascii="Consolas" w:hAnsi="Consolas" w:cs="Consolas"/>
+                    </w:rPr>
+                  </w:pPr>
+                  <w:r>
+                    <w:rPr>
+                      <w:rFonts w:ascii="Consolas" w:hAnsi="Consolas" w:cs="Consolas"/>
+                    </w:rPr>
+                    <w:t>+</w:t>
+                  </w:r>
+                  <w:r>
+                    <w:rPr>
+                      <w:rFonts w:ascii="Consolas" w:hAnsi="Consolas" w:cs="Consolas"/>
+                    </w:rPr>
+                    <w:t xml:space="preserve"> </w:t>
+                  </w:r>
+                  <w:proofErr w:type="spellStart"/>
+                  <w:r>
+                    <w:rPr>
+                      <w:rFonts w:ascii="Consolas" w:hAnsi="Consolas" w:cs="Consolas"/>
+                    </w:rPr>
                     <w:t>Rect</w:t>
                   </w:r>
                   <w:proofErr w:type="spellEnd"/>
@@ -3619,7 +3934,13 @@
                     <w:rPr>
                       <w:rFonts w:ascii="Consolas" w:hAnsi="Consolas" w:cs="Consolas"/>
                     </w:rPr>
-                    <w:t xml:space="preserve">- </w:t>
+                    <w:t>-</w:t>
+                  </w:r>
+                  <w:r>
+                    <w:rPr>
+                      <w:rFonts w:ascii="Consolas" w:hAnsi="Consolas" w:cs="Consolas"/>
+                    </w:rPr>
+                    <w:t xml:space="preserve"> </w:t>
                   </w:r>
                   <w:proofErr w:type="spellStart"/>
                   <w:r>
@@ -3662,7 +3983,13 @@
                     <w:rPr>
                       <w:rFonts w:ascii="Consolas" w:hAnsi="Consolas" w:cs="Consolas"/>
                     </w:rPr>
-                    <w:t xml:space="preserve">- </w:t>
+                    <w:t>-</w:t>
+                  </w:r>
+                  <w:r>
+                    <w:rPr>
+                      <w:rFonts w:ascii="Consolas" w:hAnsi="Consolas" w:cs="Consolas"/>
+                    </w:rPr>
+                    <w:t xml:space="preserve"> </w:t>
                   </w:r>
                   <w:proofErr w:type="spellStart"/>
                   <w:r>
@@ -3695,261 +4022,6 @@
                       <w:rFonts w:ascii="Consolas" w:hAnsi="Consolas" w:cs="Consolas"/>
                     </w:rPr>
                   </w:pPr>
-                  <w:r>
-                    <w:rPr>
-                      <w:rFonts w:ascii="Consolas" w:hAnsi="Consolas" w:cs="Consolas"/>
-                    </w:rPr>
-                    <w:t xml:space="preserve">+ </w:t>
-                  </w:r>
-                  <w:r>
-                    <w:rPr>
-                      <w:rFonts w:ascii="Consolas" w:hAnsi="Consolas" w:cs="Consolas"/>
-                    </w:rPr>
-                    <w:t>damage</w:t>
-                  </w:r>
-                  <w:r>
-                    <w:rPr>
-                      <w:rFonts w:ascii="Consolas" w:hAnsi="Consolas" w:cs="Consolas"/>
-                    </w:rPr>
-                    <w:t>: int</w:t>
-                  </w:r>
-                </w:p>
-                <w:p>
-                  <w:pPr>
-                    <w:rPr>
-                      <w:rFonts w:ascii="Consolas" w:hAnsi="Consolas" w:cs="Consolas"/>
-                    </w:rPr>
-                  </w:pPr>
-                  <w:r>
-                    <w:rPr>
-                      <w:rFonts w:ascii="Consolas" w:hAnsi="Consolas" w:cs="Consolas"/>
-                    </w:rPr>
-                    <w:t xml:space="preserve">- </w:t>
-                  </w:r>
-                  <w:proofErr w:type="spellStart"/>
-                  <w:r>
-                    <w:rPr>
-                      <w:rFonts w:ascii="Consolas" w:hAnsi="Consolas" w:cs="Consolas"/>
-                    </w:rPr>
-                    <w:t>lastShot</w:t>
-                  </w:r>
-                  <w:proofErr w:type="spellEnd"/>
-                  <w:r>
-                    <w:rPr>
-                      <w:rFonts w:ascii="Consolas" w:hAnsi="Consolas" w:cs="Consolas"/>
-                    </w:rPr>
-                    <w:t>: int</w:t>
-                  </w:r>
-                </w:p>
-                <w:p>
-                  <w:pPr>
-                    <w:rPr>
-                      <w:rFonts w:ascii="Consolas" w:hAnsi="Consolas" w:cs="Consolas"/>
-                    </w:rPr>
-                  </w:pPr>
-                  <w:r>
-                    <w:rPr>
-                      <w:rFonts w:ascii="Consolas" w:hAnsi="Consolas" w:cs="Consolas"/>
-                    </w:rPr>
-                    <w:t xml:space="preserve">- </w:t>
-                  </w:r>
-                  <w:proofErr w:type="spellStart"/>
-                  <w:r>
-                    <w:rPr>
-                      <w:rFonts w:ascii="Consolas" w:hAnsi="Consolas" w:cs="Consolas"/>
-                    </w:rPr>
-                    <w:t>updateTime</w:t>
-                  </w:r>
-                  <w:proofErr w:type="spellEnd"/>
-                  <w:r>
-                    <w:rPr>
-                      <w:rFonts w:ascii="Consolas" w:hAnsi="Consolas" w:cs="Consolas"/>
-                    </w:rPr>
-                    <w:t>: int</w:t>
-                  </w:r>
-                </w:p>
-                <w:p>
-                  <w:pPr>
-                    <w:rPr>
-                      <w:rFonts w:ascii="Consolas" w:hAnsi="Consolas" w:cs="Consolas"/>
-                    </w:rPr>
-                  </w:pPr>
-                  <w:r>
-                    <w:rPr>
-                      <w:rFonts w:ascii="Consolas" w:hAnsi="Consolas" w:cs="Consolas"/>
-                    </w:rPr>
-                    <w:t xml:space="preserve">+ </w:t>
-                  </w:r>
-                  <w:r>
-                    <w:rPr>
-                      <w:rFonts w:ascii="Consolas" w:hAnsi="Consolas" w:cs="Consolas"/>
-                    </w:rPr>
-                    <w:t>selected</w:t>
-                  </w:r>
-                  <w:r>
-                    <w:rPr>
-                      <w:rFonts w:ascii="Consolas" w:hAnsi="Consolas" w:cs="Consolas"/>
-                    </w:rPr>
-                    <w:t>: bool</w:t>
-                  </w:r>
-                </w:p>
-                <w:p>
-                  <w:pPr>
-                    <w:rPr>
-                      <w:rFonts w:ascii="Consolas" w:hAnsi="Consolas" w:cs="Consolas"/>
-                    </w:rPr>
-                  </w:pPr>
-                  <w:r>
-                    <w:rPr>
-                      <w:rFonts w:ascii="Consolas" w:hAnsi="Consolas" w:cs="Consolas"/>
-                    </w:rPr>
-                    <w:t xml:space="preserve">- </w:t>
-                  </w:r>
-                  <w:r>
-                    <w:rPr>
-                      <w:rFonts w:ascii="Consolas" w:hAnsi="Consolas" w:cs="Consolas"/>
-                    </w:rPr>
-                    <w:t>target</w:t>
-                  </w:r>
-                  <w:r>
-                    <w:rPr>
-                      <w:rFonts w:ascii="Consolas" w:hAnsi="Consolas" w:cs="Consolas"/>
-                    </w:rPr>
-                    <w:t>: Enemy</w:t>
-                  </w:r>
-                </w:p>
-                <w:p>
-                  <w:pPr>
-                    <w:rPr>
-                      <w:rFonts w:ascii="Consolas" w:hAnsi="Consolas" w:cs="Consolas"/>
-                    </w:rPr>
-                  </w:pPr>
-                  <w:r>
-                    <w:rPr>
-                      <w:rFonts w:ascii="Consolas" w:hAnsi="Consolas" w:cs="Consolas"/>
-                    </w:rPr>
-                    <w:t>+</w:t>
-                  </w:r>
-                  <w:r>
-                    <w:rPr>
-                      <w:rFonts w:ascii="Consolas" w:hAnsi="Consolas" w:cs="Consolas"/>
-                    </w:rPr>
-                    <w:t xml:space="preserve"> </w:t>
-                  </w:r>
-                  <w:proofErr w:type="spellStart"/>
-                  <w:r>
-                    <w:rPr>
-                      <w:rFonts w:ascii="Consolas" w:hAnsi="Consolas" w:cs="Consolas"/>
-                    </w:rPr>
-                    <w:t>allTurretSheets</w:t>
-                  </w:r>
-                  <w:proofErr w:type="spellEnd"/>
-                  <w:r>
-                    <w:rPr>
-                      <w:rFonts w:ascii="Consolas" w:hAnsi="Consolas" w:cs="Consolas"/>
-                    </w:rPr>
-                    <w:t>: list</w:t>
-                  </w:r>
-                </w:p>
-                <w:p>
-                  <w:pPr>
-                    <w:rPr>
-                      <w:rFonts w:ascii="Consolas" w:hAnsi="Consolas" w:cs="Consolas"/>
-                    </w:rPr>
-                  </w:pPr>
-                  <w:r>
-                    <w:rPr>
-                      <w:rFonts w:ascii="Consolas" w:hAnsi="Consolas" w:cs="Consolas"/>
-                    </w:rPr>
-                    <w:t>+</w:t>
-                  </w:r>
-                  <w:r>
-                    <w:rPr>
-                      <w:rFonts w:ascii="Consolas" w:hAnsi="Consolas" w:cs="Consolas"/>
-                    </w:rPr>
-                    <w:t xml:space="preserve"> </w:t>
-                  </w:r>
-                  <w:proofErr w:type="spellStart"/>
-                  <w:r>
-                    <w:rPr>
-                      <w:rFonts w:ascii="Consolas" w:hAnsi="Consolas" w:cs="Consolas"/>
-                    </w:rPr>
-                    <w:t>animationImages</w:t>
-                  </w:r>
-                  <w:proofErr w:type="spellEnd"/>
-                  <w:r>
-                    <w:rPr>
-                      <w:rFonts w:ascii="Consolas" w:hAnsi="Consolas" w:cs="Consolas"/>
-                    </w:rPr>
-                    <w:t>: list</w:t>
-                  </w:r>
-                </w:p>
-                <w:p>
-                  <w:pPr>
-                    <w:rPr>
-                      <w:rFonts w:ascii="Consolas" w:hAnsi="Consolas" w:cs="Consolas"/>
-                    </w:rPr>
-                  </w:pPr>
-                  <w:r>
-                    <w:rPr>
-                      <w:rFonts w:ascii="Consolas" w:hAnsi="Consolas" w:cs="Consolas"/>
-                    </w:rPr>
-                    <w:t xml:space="preserve">- </w:t>
-                  </w:r>
-                  <w:proofErr w:type="spellStart"/>
-                  <w:r>
-                    <w:rPr>
-                      <w:rFonts w:ascii="Consolas" w:hAnsi="Consolas" w:cs="Consolas"/>
-                    </w:rPr>
-                    <w:t>imageIndex</w:t>
-                  </w:r>
-                  <w:proofErr w:type="spellEnd"/>
-                  <w:r>
-                    <w:rPr>
-                      <w:rFonts w:ascii="Consolas" w:hAnsi="Consolas" w:cs="Consolas"/>
-                    </w:rPr>
-                    <w:t>: int</w:t>
-                  </w:r>
-                </w:p>
-                <w:p>
-                  <w:pPr>
-                    <w:rPr>
-                      <w:rFonts w:ascii="Consolas" w:hAnsi="Consolas" w:cs="Consolas"/>
-                    </w:rPr>
-                  </w:pPr>
-                  <w:r>
-                    <w:rPr>
-                      <w:rFonts w:ascii="Consolas" w:hAnsi="Consolas" w:cs="Consolas"/>
-                    </w:rPr>
-                    <w:t xml:space="preserve">- </w:t>
-                  </w:r>
-                  <w:proofErr w:type="spellStart"/>
-                  <w:r>
-                    <w:rPr>
-                      <w:rFonts w:ascii="Consolas" w:hAnsi="Consolas" w:cs="Consolas"/>
-                    </w:rPr>
-                    <w:t>rotationAngle</w:t>
-                  </w:r>
-                  <w:proofErr w:type="spellEnd"/>
-                  <w:r>
-                    <w:rPr>
-                      <w:rFonts w:ascii="Consolas" w:hAnsi="Consolas" w:cs="Consolas"/>
-                    </w:rPr>
-                    <w:t xml:space="preserve">: </w:t>
-                  </w:r>
-                  <w:r>
-                    <w:rPr>
-                      <w:rFonts w:ascii="Consolas" w:hAnsi="Consolas" w:cs="Consolas"/>
-                    </w:rPr>
-                    <w:t>float | int</w:t>
-                  </w:r>
-                </w:p>
-                <w:p>
-                  <w:pPr>
-                    <w:rPr>
-                      <w:rFonts w:ascii="Consolas" w:hAnsi="Consolas" w:cs="Consolas"/>
-                    </w:rPr>
-                  </w:pPr>
                 </w:p>
               </w:tc>
             </w:tr>
@@ -3980,6 +4052,41 @@
               </w:rPr>
               <w:t xml:space="preserve">+ </w:t>
             </w:r>
+            <w:proofErr w:type="spellStart"/>
+            <w:proofErr w:type="gramStart"/>
+            <w:r>
+              <w:rPr>
+                <w:rFonts w:ascii="Consolas" w:hAnsi="Consolas" w:cs="Consolas"/>
+              </w:rPr>
+              <w:t>setUpRange</w:t>
+            </w:r>
+            <w:proofErr w:type="spellEnd"/>
+            <w:r>
+              <w:rPr>
+                <w:rFonts w:ascii="Consolas" w:hAnsi="Consolas" w:cs="Consolas"/>
+              </w:rPr>
+              <w:t>(</w:t>
+            </w:r>
+            <w:proofErr w:type="gramEnd"/>
+            <w:r>
+              <w:rPr>
+                <w:rFonts w:ascii="Consolas" w:hAnsi="Consolas" w:cs="Consolas"/>
+              </w:rPr>
+              <w:t>)</w:t>
+            </w:r>
+          </w:p>
+          <w:p>
+            <w:pPr>
+              <w:rPr>
+                <w:rFonts w:ascii="Consolas" w:hAnsi="Consolas" w:cs="Consolas"/>
+              </w:rPr>
+            </w:pPr>
+            <w:r>
+              <w:rPr>
+                <w:rFonts w:ascii="Consolas" w:hAnsi="Consolas" w:cs="Consolas"/>
+              </w:rPr>
+              <w:t xml:space="preserve">+ </w:t>
+            </w:r>
             <w:proofErr w:type="gramStart"/>
             <w:r>
               <w:rPr>
@@ -4021,7 +4128,13 @@
               <w:rPr>
                 <w:rFonts w:ascii="Consolas" w:hAnsi="Consolas" w:cs="Consolas"/>
               </w:rPr>
-              <w:t>speedDoubled:bool</w:t>
+              <w:t>doubleSpeed</w:t>
+            </w:r>
+            <w:r>
+              <w:rPr>
+                <w:rFonts w:ascii="Consolas" w:hAnsi="Consolas" w:cs="Consolas"/>
+              </w:rPr>
+              <w:t>:bool</w:t>
             </w:r>
             <w:proofErr w:type="spellEnd"/>
             <w:r>
@@ -4253,13 +4366,6 @@
               </w:rPr>
               <w:t>)</w:t>
             </w:r>
-          </w:p>
-          <w:p>
-            <w:pPr>
-              <w:rPr>
-                <w:rFonts w:ascii="Consolas" w:hAnsi="Consolas" w:cs="Consolas"/>
-              </w:rPr>
-            </w:pPr>
           </w:p>
         </w:tc>
       </w:tr>
@@ -4493,6 +4599,33 @@
               </w:rPr>
               <w:t xml:space="preserve">- </w:t>
             </w:r>
+            <w:proofErr w:type="spellStart"/>
+            <w:r>
+              <w:rPr>
+                <w:rFonts w:ascii="Consolas" w:hAnsi="Consolas" w:cs="Consolas"/>
+              </w:rPr>
+              <w:t>speedDoubled</w:t>
+            </w:r>
+            <w:proofErr w:type="spellEnd"/>
+            <w:r>
+              <w:rPr>
+                <w:rFonts w:ascii="Consolas" w:hAnsi="Consolas" w:cs="Consolas"/>
+              </w:rPr>
+              <w:t>: bool</w:t>
+            </w:r>
+          </w:p>
+          <w:p>
+            <w:pPr>
+              <w:rPr>
+                <w:rFonts w:ascii="Consolas" w:hAnsi="Consolas" w:cs="Consolas"/>
+              </w:rPr>
+            </w:pPr>
+            <w:r>
+              <w:rPr>
+                <w:rFonts w:ascii="Consolas" w:hAnsi="Consolas" w:cs="Consolas"/>
+              </w:rPr>
+              <w:t xml:space="preserve">- </w:t>
+            </w:r>
             <w:r>
               <w:rPr>
                 <w:rFonts w:ascii="Consolas" w:hAnsi="Consolas" w:cs="Consolas"/>
@@ -4675,12 +4808,14 @@
               </w:rPr>
               <w:t xml:space="preserve">+ </w:t>
             </w:r>
-            <w:r>
-              <w:rPr>
-                <w:rFonts w:ascii="Consolas" w:hAnsi="Consolas" w:cs="Consolas"/>
-              </w:rPr>
-              <w:t>image</w:t>
-            </w:r>
+            <w:proofErr w:type="spellStart"/>
+            <w:r>
+              <w:rPr>
+                <w:rFonts w:ascii="Consolas" w:hAnsi="Consolas" w:cs="Consolas"/>
+              </w:rPr>
+              <w:t>originalImage</w:t>
+            </w:r>
+            <w:proofErr w:type="spellEnd"/>
             <w:r>
               <w:rPr>
                 <w:rFonts w:ascii="Consolas" w:hAnsi="Consolas" w:cs="Consolas"/>
@@ -4714,43 +4849,14 @@
               <w:rPr>
                 <w:rFonts w:ascii="Consolas" w:hAnsi="Consolas" w:cs="Consolas"/>
               </w:rPr>
-              <w:t>+</w:t>
-            </w:r>
-            <w:r>
-              <w:rPr>
-                <w:rFonts w:ascii="Consolas" w:hAnsi="Consolas" w:cs="Consolas"/>
-              </w:rPr>
-              <w:t xml:space="preserve"> </w:t>
-            </w:r>
-            <w:proofErr w:type="spellStart"/>
-            <w:r>
-              <w:rPr>
-                <w:rFonts w:ascii="Consolas" w:hAnsi="Consolas" w:cs="Consolas"/>
-              </w:rPr>
-              <w:t>originalImage</w:t>
-            </w:r>
-            <w:proofErr w:type="spellEnd"/>
-          </w:p>
-          <w:p>
-            <w:pPr>
-              <w:rPr>
-                <w:rFonts w:ascii="Consolas" w:hAnsi="Consolas" w:cs="Consolas"/>
-              </w:rPr>
-            </w:pPr>
-            <w:r>
-              <w:rPr>
-                <w:rFonts w:ascii="Consolas" w:hAnsi="Consolas" w:cs="Consolas"/>
-              </w:rPr>
               <w:t xml:space="preserve">+ </w:t>
             </w:r>
-            <w:proofErr w:type="spellStart"/>
-            <w:r>
-              <w:rPr>
-                <w:rFonts w:ascii="Consolas" w:hAnsi="Consolas" w:cs="Consolas"/>
-              </w:rPr>
-              <w:t>rect</w:t>
-            </w:r>
-            <w:proofErr w:type="spellEnd"/>
+            <w:r>
+              <w:rPr>
+                <w:rFonts w:ascii="Consolas" w:hAnsi="Consolas" w:cs="Consolas"/>
+              </w:rPr>
+              <w:t>image</w:t>
+            </w:r>
             <w:r>
               <w:rPr>
                 <w:rFonts w:ascii="Consolas" w:hAnsi="Consolas" w:cs="Consolas"/>
@@ -4763,6 +4869,49 @@
               <w:rPr>
                 <w:rFonts w:ascii="Consolas" w:hAnsi="Consolas" w:cs="Consolas"/>
               </w:rPr>
+              <w:t>pygame.surface</w:t>
+            </w:r>
+            <w:proofErr w:type="gramEnd"/>
+            <w:r>
+              <w:rPr>
+                <w:rFonts w:ascii="Consolas" w:hAnsi="Consolas" w:cs="Consolas"/>
+              </w:rPr>
+              <w:t>.Surface</w:t>
+            </w:r>
+            <w:proofErr w:type="spellEnd"/>
+          </w:p>
+          <w:p>
+            <w:pPr>
+              <w:rPr>
+                <w:rFonts w:ascii="Consolas" w:hAnsi="Consolas" w:cs="Consolas"/>
+              </w:rPr>
+            </w:pPr>
+            <w:r>
+              <w:rPr>
+                <w:rFonts w:ascii="Consolas" w:hAnsi="Consolas" w:cs="Consolas"/>
+              </w:rPr>
+              <w:t xml:space="preserve">+ </w:t>
+            </w:r>
+            <w:proofErr w:type="spellStart"/>
+            <w:r>
+              <w:rPr>
+                <w:rFonts w:ascii="Consolas" w:hAnsi="Consolas" w:cs="Consolas"/>
+              </w:rPr>
+              <w:t>rect</w:t>
+            </w:r>
+            <w:proofErr w:type="spellEnd"/>
+            <w:r>
+              <w:rPr>
+                <w:rFonts w:ascii="Consolas" w:hAnsi="Consolas" w:cs="Consolas"/>
+              </w:rPr>
+              <w:t xml:space="preserve">: </w:t>
+            </w:r>
+            <w:proofErr w:type="spellStart"/>
+            <w:proofErr w:type="gramStart"/>
+            <w:r>
+              <w:rPr>
+                <w:rFonts w:ascii="Consolas" w:hAnsi="Consolas" w:cs="Consolas"/>
+              </w:rPr>
               <w:t>pygame.Rect</w:t>
             </w:r>
             <w:proofErr w:type="spellEnd"/>
@@ -4794,13 +4943,6 @@
               </w:rPr>
               <w:t>int, int] | Tuple[float, float])</w:t>
             </w:r>
-          </w:p>
-          <w:p>
-            <w:pPr>
-              <w:rPr>
-                <w:rFonts w:ascii="Consolas" w:hAnsi="Consolas" w:cs="Consolas"/>
-              </w:rPr>
-            </w:pPr>
           </w:p>
         </w:tc>
       </w:tr>
@@ -4846,7 +4988,13 @@
               <w:rPr>
                 <w:rFonts w:ascii="Consolas" w:hAnsi="Consolas" w:cs="Consolas"/>
               </w:rPr>
-              <w:t>speedDoubled:bool</w:t>
+              <w:t>doubleSpeed</w:t>
+            </w:r>
+            <w:r>
+              <w:rPr>
+                <w:rFonts w:ascii="Consolas" w:hAnsi="Consolas" w:cs="Consolas"/>
+              </w:rPr>
+              <w:t>:bool</w:t>
             </w:r>
             <w:proofErr w:type="spellEnd"/>
             <w:r>
@@ -4928,13 +5076,7 @@
               <w:rPr>
                 <w:rFonts w:ascii="Consolas" w:hAnsi="Consolas" w:cs="Consolas"/>
               </w:rPr>
-              <w:t>+</w:t>
-            </w:r>
-            <w:r>
-              <w:rPr>
-                <w:rFonts w:ascii="Consolas" w:hAnsi="Consolas" w:cs="Consolas"/>
-              </w:rPr>
-              <w:t xml:space="preserve"> </w:t>
+              <w:t xml:space="preserve">+ </w:t>
             </w:r>
             <w:proofErr w:type="gramStart"/>
             <w:r>
@@ -5052,112 +5194,116 @@
               <w:rPr>
                 <w:rFonts w:ascii="Consolas" w:hAnsi="Consolas" w:cs="Consolas"/>
               </w:rPr>
+              <w:t>+ health: int</w:t>
+            </w:r>
+          </w:p>
+          <w:p>
+            <w:pPr>
+              <w:rPr>
+                <w:rFonts w:ascii="Consolas" w:hAnsi="Consolas" w:cs="Consolas"/>
+              </w:rPr>
+            </w:pPr>
+            <w:r>
+              <w:rPr>
+                <w:rFonts w:ascii="Consolas" w:hAnsi="Consolas" w:cs="Consolas"/>
+              </w:rPr>
+              <w:t xml:space="preserve">+ </w:t>
+            </w:r>
+            <w:proofErr w:type="spellStart"/>
+            <w:r>
+              <w:rPr>
+                <w:rFonts w:ascii="Consolas" w:hAnsi="Consolas" w:cs="Consolas"/>
+              </w:rPr>
+              <w:t>movementSpeed</w:t>
+            </w:r>
+            <w:proofErr w:type="spellEnd"/>
+            <w:r>
+              <w:rPr>
+                <w:rFonts w:ascii="Consolas" w:hAnsi="Consolas" w:cs="Consolas"/>
+              </w:rPr>
+              <w:t>: int</w:t>
+            </w:r>
+          </w:p>
+          <w:p>
+            <w:pPr>
+              <w:rPr>
+                <w:rFonts w:ascii="Consolas" w:hAnsi="Consolas" w:cs="Consolas"/>
+              </w:rPr>
+            </w:pPr>
+            <w:r>
+              <w:rPr>
+                <w:rFonts w:ascii="Consolas" w:hAnsi="Consolas" w:cs="Consolas"/>
+              </w:rPr>
               <w:t>+</w:t>
             </w:r>
             <w:r>
               <w:rPr>
                 <w:rFonts w:ascii="Consolas" w:hAnsi="Consolas" w:cs="Consolas"/>
               </w:rPr>
-              <w:t xml:space="preserve"> </w:t>
+              <w:t xml:space="preserve"> worth: int</w:t>
+            </w:r>
+          </w:p>
+          <w:p>
+            <w:pPr>
+              <w:rPr>
+                <w:rFonts w:ascii="Consolas" w:hAnsi="Consolas" w:cs="Consolas"/>
+              </w:rPr>
+            </w:pPr>
+            <w:r>
+              <w:rPr>
+                <w:rFonts w:ascii="Consolas" w:hAnsi="Consolas" w:cs="Consolas"/>
+              </w:rPr>
+              <w:t>+</w:t>
+            </w:r>
+            <w:r>
+              <w:rPr>
+                <w:rFonts w:ascii="Consolas" w:hAnsi="Consolas" w:cs="Consolas"/>
+              </w:rPr>
+              <w:t xml:space="preserve"> damage: int</w:t>
+            </w:r>
+          </w:p>
+          <w:p>
+            <w:pPr>
+              <w:rPr>
+                <w:rFonts w:ascii="Consolas" w:hAnsi="Consolas" w:cs="Consolas"/>
+              </w:rPr>
+            </w:pPr>
+            <w:r>
+              <w:rPr>
+                <w:rFonts w:ascii="Consolas" w:hAnsi="Consolas" w:cs="Consolas"/>
+              </w:rPr>
+              <w:t xml:space="preserve">+ </w:t>
             </w:r>
             <w:proofErr w:type="spellStart"/>
             <w:r>
               <w:rPr>
                 <w:rFonts w:ascii="Consolas" w:hAnsi="Consolas" w:cs="Consolas"/>
               </w:rPr>
-              <w:t>OriginalI</w:t>
-            </w:r>
-            <w:r>
-              <w:rPr>
-                <w:rFonts w:ascii="Consolas" w:hAnsi="Consolas" w:cs="Consolas"/>
-              </w:rPr>
-              <w:t>mage</w:t>
+              <w:t>OriginalImage</w:t>
             </w:r>
             <w:proofErr w:type="spellEnd"/>
-          </w:p>
-          <w:p>
-            <w:pPr>
-              <w:rPr>
-                <w:rFonts w:ascii="Consolas" w:hAnsi="Consolas" w:cs="Consolas"/>
-              </w:rPr>
-            </w:pPr>
-            <w:r>
-              <w:rPr>
-                <w:rFonts w:ascii="Consolas" w:hAnsi="Consolas" w:cs="Consolas"/>
-              </w:rPr>
-              <w:t>+ health: int</w:t>
-            </w:r>
-          </w:p>
-          <w:p>
-            <w:pPr>
-              <w:rPr>
-                <w:rFonts w:ascii="Consolas" w:hAnsi="Consolas" w:cs="Consolas"/>
-              </w:rPr>
-            </w:pPr>
-            <w:r>
-              <w:rPr>
-                <w:rFonts w:ascii="Consolas" w:hAnsi="Consolas" w:cs="Consolas"/>
-              </w:rPr>
-              <w:t>+</w:t>
-            </w:r>
-            <w:r>
-              <w:rPr>
-                <w:rFonts w:ascii="Consolas" w:hAnsi="Consolas" w:cs="Consolas"/>
-              </w:rPr>
-              <w:t xml:space="preserve"> worth: int</w:t>
-            </w:r>
-          </w:p>
-          <w:p>
-            <w:pPr>
-              <w:rPr>
-                <w:rFonts w:ascii="Consolas" w:hAnsi="Consolas" w:cs="Consolas"/>
-              </w:rPr>
-            </w:pPr>
-            <w:r>
-              <w:rPr>
-                <w:rFonts w:ascii="Consolas" w:hAnsi="Consolas" w:cs="Consolas"/>
-              </w:rPr>
-              <w:t>+</w:t>
-            </w:r>
-            <w:r>
-              <w:rPr>
-                <w:rFonts w:ascii="Consolas" w:hAnsi="Consolas" w:cs="Consolas"/>
-              </w:rPr>
-              <w:t xml:space="preserve"> damage: int</w:t>
-            </w:r>
-          </w:p>
-          <w:p>
-            <w:pPr>
-              <w:rPr>
-                <w:rFonts w:ascii="Consolas" w:hAnsi="Consolas" w:cs="Consolas"/>
-              </w:rPr>
-            </w:pPr>
-            <w:r>
-              <w:rPr>
-                <w:rFonts w:ascii="Consolas" w:hAnsi="Consolas" w:cs="Consolas"/>
-              </w:rPr>
-              <w:t>+</w:t>
-            </w:r>
-            <w:r>
-              <w:rPr>
-                <w:rFonts w:ascii="Consolas" w:hAnsi="Consolas" w:cs="Consolas"/>
-              </w:rPr>
-              <w:t xml:space="preserve"> </w:t>
+            <w:r>
+              <w:rPr>
+                <w:rFonts w:ascii="Consolas" w:hAnsi="Consolas" w:cs="Consolas"/>
+              </w:rPr>
+              <w:t xml:space="preserve">: </w:t>
             </w:r>
             <w:proofErr w:type="spellStart"/>
-            <w:r>
-              <w:rPr>
-                <w:rFonts w:ascii="Consolas" w:hAnsi="Consolas" w:cs="Consolas"/>
-              </w:rPr>
-              <w:t>movementSpeed</w:t>
+            <w:proofErr w:type="gramStart"/>
+            <w:r>
+              <w:rPr>
+                <w:rFonts w:ascii="Consolas" w:hAnsi="Consolas" w:cs="Consolas"/>
+              </w:rPr>
+              <w:t>pygame.surface</w:t>
+            </w:r>
+            <w:proofErr w:type="gramEnd"/>
+            <w:r>
+              <w:rPr>
+                <w:rFonts w:ascii="Consolas" w:hAnsi="Consolas" w:cs="Consolas"/>
+              </w:rPr>
+              <w:t>.Surface</w:t>
             </w:r>
             <w:proofErr w:type="spellEnd"/>
-            <w:r>
-              <w:rPr>
-                <w:rFonts w:ascii="Consolas" w:hAnsi="Consolas" w:cs="Consolas"/>
-              </w:rPr>
-              <w:t>: int</w:t>
-            </w:r>
           </w:p>
         </w:tc>
       </w:tr>
@@ -5265,112 +5411,104 @@
               <w:rPr>
                 <w:rFonts w:ascii="Consolas" w:hAnsi="Consolas" w:cs="Consolas"/>
               </w:rPr>
-              <w:t>+</w:t>
-            </w:r>
-            <w:r>
-              <w:rPr>
-                <w:rFonts w:ascii="Consolas" w:hAnsi="Consolas" w:cs="Consolas"/>
-              </w:rPr>
-              <w:t xml:space="preserve"> </w:t>
+              <w:t>+ health: int</w:t>
+            </w:r>
+          </w:p>
+          <w:p>
+            <w:pPr>
+              <w:rPr>
+                <w:rFonts w:ascii="Consolas" w:hAnsi="Consolas" w:cs="Consolas"/>
+              </w:rPr>
+            </w:pPr>
+            <w:r>
+              <w:rPr>
+                <w:rFonts w:ascii="Consolas" w:hAnsi="Consolas" w:cs="Consolas"/>
+              </w:rPr>
+              <w:t xml:space="preserve">+ </w:t>
             </w:r>
             <w:proofErr w:type="spellStart"/>
             <w:r>
               <w:rPr>
                 <w:rFonts w:ascii="Consolas" w:hAnsi="Consolas" w:cs="Consolas"/>
               </w:rPr>
-              <w:t>originalI</w:t>
-            </w:r>
-            <w:r>
-              <w:rPr>
-                <w:rFonts w:ascii="Consolas" w:hAnsi="Consolas" w:cs="Consolas"/>
-              </w:rPr>
-              <w:t>image</w:t>
+              <w:t>movementSpeed</w:t>
             </w:r>
             <w:proofErr w:type="spellEnd"/>
-          </w:p>
-          <w:p>
-            <w:pPr>
-              <w:rPr>
-                <w:rFonts w:ascii="Consolas" w:hAnsi="Consolas" w:cs="Consolas"/>
-              </w:rPr>
-            </w:pPr>
-            <w:r>
-              <w:rPr>
-                <w:rFonts w:ascii="Consolas" w:hAnsi="Consolas" w:cs="Consolas"/>
-              </w:rPr>
-              <w:t>+ health: int</w:t>
-            </w:r>
-          </w:p>
-          <w:p>
-            <w:pPr>
-              <w:rPr>
-                <w:rFonts w:ascii="Consolas" w:hAnsi="Consolas" w:cs="Consolas"/>
-              </w:rPr>
-            </w:pPr>
-            <w:r>
-              <w:rPr>
-                <w:rFonts w:ascii="Consolas" w:hAnsi="Consolas" w:cs="Consolas"/>
-              </w:rPr>
-              <w:t>+</w:t>
-            </w:r>
-            <w:r>
-              <w:rPr>
-                <w:rFonts w:ascii="Consolas" w:hAnsi="Consolas" w:cs="Consolas"/>
-              </w:rPr>
-              <w:t xml:space="preserve"> worth: int</w:t>
-            </w:r>
-          </w:p>
-          <w:p>
-            <w:pPr>
-              <w:rPr>
-                <w:rFonts w:ascii="Consolas" w:hAnsi="Consolas" w:cs="Consolas"/>
-              </w:rPr>
-            </w:pPr>
-            <w:r>
-              <w:rPr>
-                <w:rFonts w:ascii="Consolas" w:hAnsi="Consolas" w:cs="Consolas"/>
-              </w:rPr>
-              <w:t>+</w:t>
-            </w:r>
-            <w:r>
-              <w:rPr>
-                <w:rFonts w:ascii="Consolas" w:hAnsi="Consolas" w:cs="Consolas"/>
-              </w:rPr>
-              <w:t xml:space="preserve"> damage: int</w:t>
-            </w:r>
-          </w:p>
-          <w:p>
-            <w:pPr>
-              <w:rPr>
-                <w:rFonts w:ascii="Consolas" w:hAnsi="Consolas" w:cs="Consolas"/>
-              </w:rPr>
-            </w:pPr>
-            <w:r>
-              <w:rPr>
-                <w:rFonts w:ascii="Consolas" w:hAnsi="Consolas" w:cs="Consolas"/>
-              </w:rPr>
-              <w:t>+</w:t>
-            </w:r>
-            <w:r>
-              <w:rPr>
-                <w:rFonts w:ascii="Consolas" w:hAnsi="Consolas" w:cs="Consolas"/>
-              </w:rPr>
-              <w:t xml:space="preserve"> </w:t>
+            <w:r>
+              <w:rPr>
+                <w:rFonts w:ascii="Consolas" w:hAnsi="Consolas" w:cs="Consolas"/>
+              </w:rPr>
+              <w:t>: int</w:t>
+            </w:r>
+          </w:p>
+          <w:p>
+            <w:pPr>
+              <w:rPr>
+                <w:rFonts w:ascii="Consolas" w:hAnsi="Consolas" w:cs="Consolas"/>
+              </w:rPr>
+            </w:pPr>
+            <w:r>
+              <w:rPr>
+                <w:rFonts w:ascii="Consolas" w:hAnsi="Consolas" w:cs="Consolas"/>
+              </w:rPr>
+              <w:t>+ worth: int</w:t>
+            </w:r>
+          </w:p>
+          <w:p>
+            <w:pPr>
+              <w:rPr>
+                <w:rFonts w:ascii="Consolas" w:hAnsi="Consolas" w:cs="Consolas"/>
+              </w:rPr>
+            </w:pPr>
+            <w:r>
+              <w:rPr>
+                <w:rFonts w:ascii="Consolas" w:hAnsi="Consolas" w:cs="Consolas"/>
+              </w:rPr>
+              <w:t>+ damage: int</w:t>
+            </w:r>
+          </w:p>
+          <w:p>
+            <w:pPr>
+              <w:rPr>
+                <w:rFonts w:ascii="Consolas" w:hAnsi="Consolas" w:cs="Consolas"/>
+              </w:rPr>
+            </w:pPr>
+            <w:r>
+              <w:rPr>
+                <w:rFonts w:ascii="Consolas" w:hAnsi="Consolas" w:cs="Consolas"/>
+              </w:rPr>
+              <w:t xml:space="preserve">+ </w:t>
             </w:r>
             <w:proofErr w:type="spellStart"/>
             <w:r>
               <w:rPr>
                 <w:rFonts w:ascii="Consolas" w:hAnsi="Consolas" w:cs="Consolas"/>
               </w:rPr>
-              <w:t>movementSpeed</w:t>
+              <w:t>OriginalImage</w:t>
             </w:r>
             <w:proofErr w:type="spellEnd"/>
             <w:r>
               <w:rPr>
                 <w:rFonts w:ascii="Consolas" w:hAnsi="Consolas" w:cs="Consolas"/>
               </w:rPr>
-              <w:t>: int</w:t>
-            </w:r>
+              <w:t xml:space="preserve">: </w:t>
+            </w:r>
+            <w:proofErr w:type="spellStart"/>
+            <w:proofErr w:type="gramStart"/>
+            <w:r>
+              <w:rPr>
+                <w:rFonts w:ascii="Consolas" w:hAnsi="Consolas" w:cs="Consolas"/>
+              </w:rPr>
+              <w:t>pygame.surface</w:t>
+            </w:r>
+            <w:proofErr w:type="gramEnd"/>
+            <w:r>
+              <w:rPr>
+                <w:rFonts w:ascii="Consolas" w:hAnsi="Consolas" w:cs="Consolas"/>
+              </w:rPr>
+              <w:t>.Surface</w:t>
+            </w:r>
+            <w:proofErr w:type="spellEnd"/>
           </w:p>
         </w:tc>
       </w:tr>
@@ -5498,6 +5636,46 @@
               <w:rPr>
                 <w:rFonts w:ascii="Consolas" w:hAnsi="Consolas" w:cs="Consolas"/>
               </w:rPr>
+              <w:t>upgradeCost</w:t>
+            </w:r>
+            <w:proofErr w:type="spellEnd"/>
+            <w:r>
+              <w:rPr>
+                <w:rFonts w:ascii="Consolas" w:hAnsi="Consolas" w:cs="Consolas"/>
+              </w:rPr>
+              <w:t>: int</w:t>
+            </w:r>
+          </w:p>
+          <w:p>
+            <w:pPr>
+              <w:rPr>
+                <w:rFonts w:ascii="Consolas" w:hAnsi="Consolas" w:cs="Consolas"/>
+              </w:rPr>
+            </w:pPr>
+            <w:r>
+              <w:rPr>
+                <w:rFonts w:ascii="Consolas" w:hAnsi="Consolas" w:cs="Consolas"/>
+              </w:rPr>
+              <w:t>+ cost: int</w:t>
+            </w:r>
+          </w:p>
+          <w:p>
+            <w:pPr>
+              <w:rPr>
+                <w:rFonts w:ascii="Consolas" w:hAnsi="Consolas" w:cs="Consolas"/>
+              </w:rPr>
+            </w:pPr>
+            <w:r>
+              <w:rPr>
+                <w:rFonts w:ascii="Consolas" w:hAnsi="Consolas" w:cs="Consolas"/>
+              </w:rPr>
+              <w:t xml:space="preserve">+ </w:t>
+            </w:r>
+            <w:proofErr w:type="spellStart"/>
+            <w:r>
+              <w:rPr>
+                <w:rFonts w:ascii="Consolas" w:hAnsi="Consolas" w:cs="Consolas"/>
+              </w:rPr>
               <w:t>sfx</w:t>
             </w:r>
             <w:proofErr w:type="spellEnd"/>
@@ -5534,46 +5712,6 @@
               <w:rPr>
                 <w:rFonts w:ascii="Consolas" w:hAnsi="Consolas" w:cs="Consolas"/>
               </w:rPr>
-              <w:t xml:space="preserve">+ </w:t>
-            </w:r>
-            <w:proofErr w:type="spellStart"/>
-            <w:r>
-              <w:rPr>
-                <w:rFonts w:ascii="Consolas" w:hAnsi="Consolas" w:cs="Consolas"/>
-              </w:rPr>
-              <w:t>upgradeCost</w:t>
-            </w:r>
-            <w:proofErr w:type="spellEnd"/>
-            <w:r>
-              <w:rPr>
-                <w:rFonts w:ascii="Consolas" w:hAnsi="Consolas" w:cs="Consolas"/>
-              </w:rPr>
-              <w:t>: int</w:t>
-            </w:r>
-          </w:p>
-          <w:p>
-            <w:pPr>
-              <w:rPr>
-                <w:rFonts w:ascii="Consolas" w:hAnsi="Consolas" w:cs="Consolas"/>
-              </w:rPr>
-            </w:pPr>
-            <w:r>
-              <w:rPr>
-                <w:rFonts w:ascii="Consolas" w:hAnsi="Consolas" w:cs="Consolas"/>
-              </w:rPr>
-              <w:t>+ cost: int</w:t>
-            </w:r>
-          </w:p>
-          <w:p>
-            <w:pPr>
-              <w:rPr>
-                <w:rFonts w:ascii="Consolas" w:hAnsi="Consolas" w:cs="Consolas"/>
-              </w:rPr>
-            </w:pPr>
-            <w:r>
-              <w:rPr>
-                <w:rFonts w:ascii="Consolas" w:hAnsi="Consolas" w:cs="Consolas"/>
-              </w:rPr>
               <w:t>+ range: int</w:t>
             </w:r>
           </w:p>
@@ -5588,6 +5726,19 @@
                 <w:rFonts w:ascii="Consolas" w:hAnsi="Consolas" w:cs="Consolas"/>
               </w:rPr>
               <w:t>+ cooldown: int</w:t>
+            </w:r>
+          </w:p>
+          <w:p>
+            <w:pPr>
+              <w:rPr>
+                <w:rFonts w:ascii="Consolas" w:hAnsi="Consolas" w:cs="Consolas"/>
+              </w:rPr>
+            </w:pPr>
+            <w:r>
+              <w:rPr>
+                <w:rFonts w:ascii="Consolas" w:hAnsi="Consolas" w:cs="Consolas"/>
+              </w:rPr>
+              <w:t>+ damage: int</w:t>
             </w:r>
           </w:p>
           <w:p>
@@ -5752,46 +5903,6 @@
             </w:r>
             <w:proofErr w:type="spellEnd"/>
             <w:proofErr w:type="gramEnd"/>
-          </w:p>
-          <w:p>
-            <w:pPr>
-              <w:rPr>
-                <w:rFonts w:ascii="Consolas" w:hAnsi="Consolas" w:cs="Consolas"/>
-              </w:rPr>
-            </w:pPr>
-            <w:r>
-              <w:rPr>
-                <w:rFonts w:ascii="Consolas" w:hAnsi="Consolas" w:cs="Consolas"/>
-              </w:rPr>
-              <w:t>+ damage: int</w:t>
-            </w:r>
-          </w:p>
-          <w:p>
-            <w:pPr>
-              <w:rPr>
-                <w:rFonts w:ascii="Consolas" w:hAnsi="Consolas" w:cs="Consolas"/>
-              </w:rPr>
-            </w:pPr>
-            <w:r>
-              <w:rPr>
-                <w:rFonts w:ascii="Consolas" w:hAnsi="Consolas" w:cs="Consolas"/>
-              </w:rPr>
-              <w:t xml:space="preserve">+ </w:t>
-            </w:r>
-            <w:proofErr w:type="spellStart"/>
-            <w:r>
-              <w:rPr>
-                <w:rFonts w:ascii="Consolas" w:hAnsi="Consolas" w:cs="Consolas"/>
-              </w:rPr>
-              <w:t>allTurretSheets</w:t>
-            </w:r>
-            <w:proofErr w:type="spellEnd"/>
-            <w:r>
-              <w:rPr>
-                <w:rFonts w:ascii="Consolas" w:hAnsi="Consolas" w:cs="Consolas"/>
-              </w:rPr>
-              <w:t>: list</w:t>
-            </w:r>
           </w:p>
         </w:tc>
       </w:tr>
@@ -5810,62 +5921,6 @@
         </w:tc>
       </w:tr>
     </w:tbl>
-    <w:p>
-      <w:pPr>
-        <w:rPr>
-          <w:rFonts w:ascii="Consolas" w:hAnsi="Consolas" w:cs="Consolas"/>
-        </w:rPr>
-      </w:pPr>
-    </w:p>
-    <w:p>
-      <w:pPr>
-        <w:rPr>
-          <w:rFonts w:ascii="Consolas" w:hAnsi="Consolas" w:cs="Consolas"/>
-        </w:rPr>
-      </w:pPr>
-    </w:p>
-    <w:p>
-      <w:pPr>
-        <w:rPr>
-          <w:rFonts w:ascii="Consolas" w:hAnsi="Consolas" w:cs="Consolas"/>
-        </w:rPr>
-      </w:pPr>
-    </w:p>
-    <w:p>
-      <w:pPr>
-        <w:rPr>
-          <w:rFonts w:ascii="Consolas" w:hAnsi="Consolas" w:cs="Consolas"/>
-        </w:rPr>
-      </w:pPr>
-    </w:p>
-    <w:p>
-      <w:pPr>
-        <w:rPr>
-          <w:rFonts w:ascii="Consolas" w:hAnsi="Consolas" w:cs="Consolas"/>
-        </w:rPr>
-      </w:pPr>
-    </w:p>
-    <w:p>
-      <w:pPr>
-        <w:rPr>
-          <w:rFonts w:ascii="Consolas" w:hAnsi="Consolas" w:cs="Consolas"/>
-        </w:rPr>
-      </w:pPr>
-    </w:p>
-    <w:p>
-      <w:pPr>
-        <w:rPr>
-          <w:rFonts w:ascii="Consolas" w:hAnsi="Consolas" w:cs="Consolas"/>
-        </w:rPr>
-      </w:pPr>
-    </w:p>
-    <w:p>
-      <w:pPr>
-        <w:rPr>
-          <w:rFonts w:ascii="Consolas" w:hAnsi="Consolas" w:cs="Consolas"/>
-        </w:rPr>
-      </w:pPr>
-    </w:p>
     <w:p>
       <w:pPr>
         <w:rPr>
@@ -5909,6 +5964,7 @@
                 <w:rFonts w:ascii="Consolas" w:hAnsi="Consolas" w:cs="Consolas"/>
                 <w:u w:val="single"/>
               </w:rPr>
+              <w:lastRenderedPageBreak/>
               <w:t>Machine</w:t>
             </w:r>
             <w:r>
@@ -5972,6 +6028,46 @@
               <w:rPr>
                 <w:rFonts w:ascii="Consolas" w:hAnsi="Consolas" w:cs="Consolas"/>
               </w:rPr>
+              <w:t>upgradeCost</w:t>
+            </w:r>
+            <w:proofErr w:type="spellEnd"/>
+            <w:r>
+              <w:rPr>
+                <w:rFonts w:ascii="Consolas" w:hAnsi="Consolas" w:cs="Consolas"/>
+              </w:rPr>
+              <w:t>: int</w:t>
+            </w:r>
+          </w:p>
+          <w:p>
+            <w:pPr>
+              <w:rPr>
+                <w:rFonts w:ascii="Consolas" w:hAnsi="Consolas" w:cs="Consolas"/>
+              </w:rPr>
+            </w:pPr>
+            <w:r>
+              <w:rPr>
+                <w:rFonts w:ascii="Consolas" w:hAnsi="Consolas" w:cs="Consolas"/>
+              </w:rPr>
+              <w:t>+ cost: int</w:t>
+            </w:r>
+          </w:p>
+          <w:p>
+            <w:pPr>
+              <w:rPr>
+                <w:rFonts w:ascii="Consolas" w:hAnsi="Consolas" w:cs="Consolas"/>
+              </w:rPr>
+            </w:pPr>
+            <w:r>
+              <w:rPr>
+                <w:rFonts w:ascii="Consolas" w:hAnsi="Consolas" w:cs="Consolas"/>
+              </w:rPr>
+              <w:t xml:space="preserve">+ </w:t>
+            </w:r>
+            <w:proofErr w:type="spellStart"/>
+            <w:r>
+              <w:rPr>
+                <w:rFonts w:ascii="Consolas" w:hAnsi="Consolas" w:cs="Consolas"/>
+              </w:rPr>
               <w:t>sfx</w:t>
             </w:r>
             <w:proofErr w:type="spellEnd"/>
@@ -6008,46 +6104,6 @@
               <w:rPr>
                 <w:rFonts w:ascii="Consolas" w:hAnsi="Consolas" w:cs="Consolas"/>
               </w:rPr>
-              <w:t xml:space="preserve">+ </w:t>
-            </w:r>
-            <w:proofErr w:type="spellStart"/>
-            <w:r>
-              <w:rPr>
-                <w:rFonts w:ascii="Consolas" w:hAnsi="Consolas" w:cs="Consolas"/>
-              </w:rPr>
-              <w:t>upgradeCost</w:t>
-            </w:r>
-            <w:proofErr w:type="spellEnd"/>
-            <w:r>
-              <w:rPr>
-                <w:rFonts w:ascii="Consolas" w:hAnsi="Consolas" w:cs="Consolas"/>
-              </w:rPr>
-              <w:t>: int</w:t>
-            </w:r>
-          </w:p>
-          <w:p>
-            <w:pPr>
-              <w:rPr>
-                <w:rFonts w:ascii="Consolas" w:hAnsi="Consolas" w:cs="Consolas"/>
-              </w:rPr>
-            </w:pPr>
-            <w:r>
-              <w:rPr>
-                <w:rFonts w:ascii="Consolas" w:hAnsi="Consolas" w:cs="Consolas"/>
-              </w:rPr>
-              <w:t>+ cost: int</w:t>
-            </w:r>
-          </w:p>
-          <w:p>
-            <w:pPr>
-              <w:rPr>
-                <w:rFonts w:ascii="Consolas" w:hAnsi="Consolas" w:cs="Consolas"/>
-              </w:rPr>
-            </w:pPr>
-            <w:r>
-              <w:rPr>
-                <w:rFonts w:ascii="Consolas" w:hAnsi="Consolas" w:cs="Consolas"/>
-              </w:rPr>
               <w:t>+ range: int</w:t>
             </w:r>
           </w:p>
@@ -6062,6 +6118,19 @@
                 <w:rFonts w:ascii="Consolas" w:hAnsi="Consolas" w:cs="Consolas"/>
               </w:rPr>
               <w:t>+ cooldown: int</w:t>
+            </w:r>
+          </w:p>
+          <w:p>
+            <w:pPr>
+              <w:rPr>
+                <w:rFonts w:ascii="Consolas" w:hAnsi="Consolas" w:cs="Consolas"/>
+              </w:rPr>
+            </w:pPr>
+            <w:r>
+              <w:rPr>
+                <w:rFonts w:ascii="Consolas" w:hAnsi="Consolas" w:cs="Consolas"/>
+              </w:rPr>
+              <w:t>+ damage: int</w:t>
             </w:r>
           </w:p>
           <w:p>
@@ -6226,19 +6295,6 @@
             </w:r>
             <w:proofErr w:type="spellEnd"/>
             <w:proofErr w:type="gramEnd"/>
-          </w:p>
-          <w:p>
-            <w:pPr>
-              <w:rPr>
-                <w:rFonts w:ascii="Consolas" w:hAnsi="Consolas" w:cs="Consolas"/>
-              </w:rPr>
-            </w:pPr>
-            <w:r>
-              <w:rPr>
-                <w:rFonts w:ascii="Consolas" w:hAnsi="Consolas" w:cs="Consolas"/>
-              </w:rPr>
-              <w:t>+ damage: int</w:t>
-            </w:r>
           </w:p>
           <w:p>
             <w:pPr>
@@ -6343,16 +6399,16 @@
         <mc:AlternateContent>
           <mc:Choice Requires="wps">
             <w:drawing>
-              <wp:anchor distT="0" distB="0" distL="114300" distR="114300" simplePos="0" relativeHeight="251659264" behindDoc="0" locked="0" layoutInCell="1" allowOverlap="1" wp14:anchorId="363EFD46" wp14:editId="0CC90CE3">
+              <wp:anchor distT="0" distB="0" distL="114300" distR="114300" simplePos="0" relativeHeight="251659264" behindDoc="0" locked="0" layoutInCell="1" allowOverlap="1" wp14:anchorId="363EFD46" wp14:editId="157BE6E3">
                 <wp:simplePos x="0" y="0"/>
                 <wp:positionH relativeFrom="column">
-                  <wp:posOffset>43469</wp:posOffset>
+                  <wp:posOffset>39312</wp:posOffset>
                 </wp:positionH>
                 <wp:positionV relativeFrom="paragraph">
-                  <wp:posOffset>104025</wp:posOffset>
+                  <wp:posOffset>98367</wp:posOffset>
                 </wp:positionV>
-                <wp:extent cx="6545753" cy="4405745"/>
-                <wp:effectExtent l="0" t="0" r="7620" b="13970"/>
+                <wp:extent cx="6545753" cy="5663738"/>
+                <wp:effectExtent l="0" t="0" r="7620" b="13335"/>
                 <wp:wrapNone/>
                 <wp:docPr id="1953736561" name="Text Box 1"/>
                 <wp:cNvGraphicFramePr/>
@@ -6363,7 +6419,7 @@
                       <wps:spPr>
                         <a:xfrm>
                           <a:off x="0" y="0"/>
-                          <a:ext cx="6545753" cy="4405745"/>
+                          <a:ext cx="6545753" cy="5663738"/>
                         </a:xfrm>
                         <a:prstGeom prst="rect">
                           <a:avLst/>
@@ -6391,18 +6447,64 @@
                               </w:rPr>
                               <w:t xml:space="preserve">FUNCTION </w:t>
                             </w:r>
-                            <w:r>
-                              <w:rPr>
-                                <w:rFonts w:ascii="Consolas" w:hAnsi="Consolas" w:cs="Consolas"/>
-                              </w:rPr>
-                              <w:t>createTurret(mousePosition allTurretsGroup, world</w:t>
-                            </w:r>
-                            <w:r>
-                              <w:rPr>
-                                <w:rFonts w:ascii="Consolas" w:hAnsi="Consolas" w:cs="Consolas"/>
-                              </w:rPr>
-                              <w:t>, turretType</w:t>
-                            </w:r>
+                            <w:proofErr w:type="spellStart"/>
+                            <w:proofErr w:type="gramStart"/>
+                            <w:r>
+                              <w:rPr>
+                                <w:rFonts w:ascii="Consolas" w:hAnsi="Consolas" w:cs="Consolas"/>
+                              </w:rPr>
+                              <w:t>createTurret</w:t>
+                            </w:r>
+                            <w:proofErr w:type="spellEnd"/>
+                            <w:r>
+                              <w:rPr>
+                                <w:rFonts w:ascii="Consolas" w:hAnsi="Consolas" w:cs="Consolas"/>
+                              </w:rPr>
+                              <w:t>(</w:t>
+                            </w:r>
+                            <w:proofErr w:type="spellStart"/>
+                            <w:proofErr w:type="gramEnd"/>
+                            <w:r>
+                              <w:rPr>
+                                <w:rFonts w:ascii="Consolas" w:hAnsi="Consolas" w:cs="Consolas"/>
+                              </w:rPr>
+                              <w:t>mousePosition</w:t>
+                            </w:r>
+                            <w:proofErr w:type="spellEnd"/>
+                            <w:r>
+                              <w:rPr>
+                                <w:rFonts w:ascii="Consolas" w:hAnsi="Consolas" w:cs="Consolas"/>
+                              </w:rPr>
+                              <w:t xml:space="preserve"> </w:t>
+                            </w:r>
+                            <w:proofErr w:type="spellStart"/>
+                            <w:r>
+                              <w:rPr>
+                                <w:rFonts w:ascii="Consolas" w:hAnsi="Consolas" w:cs="Consolas"/>
+                              </w:rPr>
+                              <w:t>allTurretsGroup</w:t>
+                            </w:r>
+                            <w:proofErr w:type="spellEnd"/>
+                            <w:r>
+                              <w:rPr>
+                                <w:rFonts w:ascii="Consolas" w:hAnsi="Consolas" w:cs="Consolas"/>
+                              </w:rPr>
+                              <w:t>, world</w:t>
+                            </w:r>
+                            <w:r>
+                              <w:rPr>
+                                <w:rFonts w:ascii="Consolas" w:hAnsi="Consolas" w:cs="Consolas"/>
+                              </w:rPr>
+                              <w:t xml:space="preserve">, </w:t>
+                            </w:r>
+                            <w:proofErr w:type="spellStart"/>
+                            <w:r>
+                              <w:rPr>
+                                <w:rFonts w:ascii="Consolas" w:hAnsi="Consolas" w:cs="Consolas"/>
+                              </w:rPr>
+                              <w:t>turretType</w:t>
+                            </w:r>
+                            <w:proofErr w:type="spellEnd"/>
                             <w:r>
                               <w:rPr>
                                 <w:rFonts w:ascii="Consolas" w:hAnsi="Consolas" w:cs="Consolas"/>
@@ -6417,11 +6519,41 @@
                                 <w:rFonts w:ascii="Consolas" w:hAnsi="Consolas" w:cs="Consolas"/>
                               </w:rPr>
                             </w:pPr>
-                            <w:r>
-                              <w:rPr>
-                                <w:rFonts w:ascii="Consolas" w:hAnsi="Consolas" w:cs="Consolas"/>
-                              </w:rPr>
-                              <w:t>tileX = mousePosition[0] // TILE_SIZE</w:t>
+                            <w:proofErr w:type="spellStart"/>
+                            <w:r>
+                              <w:rPr>
+                                <w:rFonts w:ascii="Consolas" w:hAnsi="Consolas" w:cs="Consolas"/>
+                              </w:rPr>
+                              <w:t>tileX</w:t>
+                            </w:r>
+                            <w:proofErr w:type="spellEnd"/>
+                            <w:r>
+                              <w:rPr>
+                                <w:rFonts w:ascii="Consolas" w:hAnsi="Consolas" w:cs="Consolas"/>
+                              </w:rPr>
+                              <w:t xml:space="preserve"> = </w:t>
+                            </w:r>
+                            <w:proofErr w:type="spellStart"/>
+                            <w:proofErr w:type="gramStart"/>
+                            <w:r>
+                              <w:rPr>
+                                <w:rFonts w:ascii="Consolas" w:hAnsi="Consolas" w:cs="Consolas"/>
+                              </w:rPr>
+                              <w:t>mousePosition</w:t>
+                            </w:r>
+                            <w:proofErr w:type="spellEnd"/>
+                            <w:r>
+                              <w:rPr>
+                                <w:rFonts w:ascii="Consolas" w:hAnsi="Consolas" w:cs="Consolas"/>
+                              </w:rPr>
+                              <w:t>[</w:t>
+                            </w:r>
+                            <w:proofErr w:type="gramEnd"/>
+                            <w:r>
+                              <w:rPr>
+                                <w:rFonts w:ascii="Consolas" w:hAnsi="Consolas" w:cs="Consolas"/>
+                              </w:rPr>
+                              <w:t>0] // TILE_SIZE</w:t>
                             </w:r>
                           </w:p>
                           <w:p>
@@ -6431,11 +6563,41 @@
                                 <w:rFonts w:ascii="Consolas" w:hAnsi="Consolas" w:cs="Consolas"/>
                               </w:rPr>
                             </w:pPr>
-                            <w:r>
-                              <w:rPr>
-                                <w:rFonts w:ascii="Consolas" w:hAnsi="Consolas" w:cs="Consolas"/>
-                              </w:rPr>
-                              <w:t>tileY = mousePosition[1] // TILE_SIZE</w:t>
+                            <w:proofErr w:type="spellStart"/>
+                            <w:r>
+                              <w:rPr>
+                                <w:rFonts w:ascii="Consolas" w:hAnsi="Consolas" w:cs="Consolas"/>
+                              </w:rPr>
+                              <w:t>tileY</w:t>
+                            </w:r>
+                            <w:proofErr w:type="spellEnd"/>
+                            <w:r>
+                              <w:rPr>
+                                <w:rFonts w:ascii="Consolas" w:hAnsi="Consolas" w:cs="Consolas"/>
+                              </w:rPr>
+                              <w:t xml:space="preserve"> = </w:t>
+                            </w:r>
+                            <w:proofErr w:type="spellStart"/>
+                            <w:proofErr w:type="gramStart"/>
+                            <w:r>
+                              <w:rPr>
+                                <w:rFonts w:ascii="Consolas" w:hAnsi="Consolas" w:cs="Consolas"/>
+                              </w:rPr>
+                              <w:t>mousePosition</w:t>
+                            </w:r>
+                            <w:proofErr w:type="spellEnd"/>
+                            <w:r>
+                              <w:rPr>
+                                <w:rFonts w:ascii="Consolas" w:hAnsi="Consolas" w:cs="Consolas"/>
+                              </w:rPr>
+                              <w:t>[</w:t>
+                            </w:r>
+                            <w:proofErr w:type="gramEnd"/>
+                            <w:r>
+                              <w:rPr>
+                                <w:rFonts w:ascii="Consolas" w:hAnsi="Consolas" w:cs="Consolas"/>
+                              </w:rPr>
+                              <w:t>1] // TILE_SIZE</w:t>
                             </w:r>
                           </w:p>
                           <w:p>
@@ -6445,12 +6607,42 @@
                                 <w:rFonts w:ascii="Consolas" w:hAnsi="Consolas" w:cs="Consolas"/>
                               </w:rPr>
                             </w:pPr>
-                            <w:r>
-                              <w:rPr>
-                                <w:rFonts w:ascii="Consolas" w:hAnsi="Consolas" w:cs="Consolas"/>
-                              </w:rPr>
-                              <w:t>mouseTileNum = tileY * TILE_ROWS + tileX</w:t>
-                            </w:r>
+                            <w:proofErr w:type="spellStart"/>
+                            <w:r>
+                              <w:rPr>
+                                <w:rFonts w:ascii="Consolas" w:hAnsi="Consolas" w:cs="Consolas"/>
+                              </w:rPr>
+                              <w:t>mouseTileNum</w:t>
+                            </w:r>
+                            <w:proofErr w:type="spellEnd"/>
+                            <w:r>
+                              <w:rPr>
+                                <w:rFonts w:ascii="Consolas" w:hAnsi="Consolas" w:cs="Consolas"/>
+                              </w:rPr>
+                              <w:t xml:space="preserve"> = </w:t>
+                            </w:r>
+                            <w:proofErr w:type="spellStart"/>
+                            <w:r>
+                              <w:rPr>
+                                <w:rFonts w:ascii="Consolas" w:hAnsi="Consolas" w:cs="Consolas"/>
+                              </w:rPr>
+                              <w:t>tileY</w:t>
+                            </w:r>
+                            <w:proofErr w:type="spellEnd"/>
+                            <w:r>
+                              <w:rPr>
+                                <w:rFonts w:ascii="Consolas" w:hAnsi="Consolas" w:cs="Consolas"/>
+                              </w:rPr>
+                              <w:t xml:space="preserve"> * TILE_ROWS + </w:t>
+                            </w:r>
+                            <w:proofErr w:type="spellStart"/>
+                            <w:r>
+                              <w:rPr>
+                                <w:rFonts w:ascii="Consolas" w:hAnsi="Consolas" w:cs="Consolas"/>
+                              </w:rPr>
+                              <w:t>tileX</w:t>
+                            </w:r>
+                            <w:proofErr w:type="spellEnd"/>
                           </w:p>
                           <w:p>
                             <w:pPr>
@@ -6463,7 +6655,37 @@
                               <w:rPr>
                                 <w:rFonts w:ascii="Consolas" w:hAnsi="Consolas" w:cs="Consolas"/>
                               </w:rPr>
-                              <w:t>IF world.tilemap[mouseTileNum] IN GRASS_TILE_VALUES THEN</w:t>
+                              <w:t xml:space="preserve">IF </w:t>
+                            </w:r>
+                            <w:proofErr w:type="spellStart"/>
+                            <w:proofErr w:type="gramStart"/>
+                            <w:r>
+                              <w:rPr>
+                                <w:rFonts w:ascii="Consolas" w:hAnsi="Consolas" w:cs="Consolas"/>
+                              </w:rPr>
+                              <w:t>world.tilemap</w:t>
+                            </w:r>
+                            <w:proofErr w:type="spellEnd"/>
+                            <w:proofErr w:type="gramEnd"/>
+                            <w:r>
+                              <w:rPr>
+                                <w:rFonts w:ascii="Consolas" w:hAnsi="Consolas" w:cs="Consolas"/>
+                              </w:rPr>
+                              <w:t>[</w:t>
+                            </w:r>
+                            <w:proofErr w:type="spellStart"/>
+                            <w:r>
+                              <w:rPr>
+                                <w:rFonts w:ascii="Consolas" w:hAnsi="Consolas" w:cs="Consolas"/>
+                              </w:rPr>
+                              <w:t>mouseTileNum</w:t>
+                            </w:r>
+                            <w:proofErr w:type="spellEnd"/>
+                            <w:r>
+                              <w:rPr>
+                                <w:rFonts w:ascii="Consolas" w:hAnsi="Consolas" w:cs="Consolas"/>
+                              </w:rPr>
+                              <w:t>] IN GRASS_TILE_VALUES THEN</w:t>
                             </w:r>
                           </w:p>
                           <w:p>
@@ -6473,11 +6695,19 @@
                                 <w:rFonts w:ascii="Consolas" w:hAnsi="Consolas" w:cs="Consolas"/>
                               </w:rPr>
                             </w:pPr>
-                            <w:r>
-                              <w:rPr>
-                                <w:rFonts w:ascii="Consolas" w:hAnsi="Consolas" w:cs="Consolas"/>
-                              </w:rPr>
-                              <w:t>tileFree = True</w:t>
+                            <w:proofErr w:type="spellStart"/>
+                            <w:r>
+                              <w:rPr>
+                                <w:rFonts w:ascii="Consolas" w:hAnsi="Consolas" w:cs="Consolas"/>
+                              </w:rPr>
+                              <w:t>tileFree</w:t>
+                            </w:r>
+                            <w:proofErr w:type="spellEnd"/>
+                            <w:r>
+                              <w:rPr>
+                                <w:rFonts w:ascii="Consolas" w:hAnsi="Consolas" w:cs="Consolas"/>
+                              </w:rPr>
+                              <w:t xml:space="preserve"> = True</w:t>
                             </w:r>
                           </w:p>
                           <w:p>
@@ -6499,7 +6729,21 @@
                               <w:rPr>
                                 <w:rFonts w:ascii="Consolas" w:hAnsi="Consolas" w:cs="Consolas"/>
                               </w:rPr>
-                              <w:t>FOR turret IN allTurretsGroup DO</w:t>
+                              <w:t xml:space="preserve">FOR turret IN </w:t>
+                            </w:r>
+                            <w:proofErr w:type="spellStart"/>
+                            <w:r>
+                              <w:rPr>
+                                <w:rFonts w:ascii="Consolas" w:hAnsi="Consolas" w:cs="Consolas"/>
+                              </w:rPr>
+                              <w:t>allTurretsGroup</w:t>
+                            </w:r>
+                            <w:proofErr w:type="spellEnd"/>
+                            <w:r>
+                              <w:rPr>
+                                <w:rFonts w:ascii="Consolas" w:hAnsi="Consolas" w:cs="Consolas"/>
+                              </w:rPr>
+                              <w:t xml:space="preserve"> DO</w:t>
                             </w:r>
                           </w:p>
                           <w:p>
@@ -6513,21 +6757,93 @@
                               <w:rPr>
                                 <w:rFonts w:ascii="Consolas" w:hAnsi="Consolas" w:cs="Consolas"/>
                               </w:rPr>
-                              <w:t>IF (tileX, tileY) == (turret.tileX, turret.tileY THEN</w:t>
+                              <w:t>IF (</w:t>
+                            </w:r>
+                            <w:proofErr w:type="spellStart"/>
+                            <w:r>
+                              <w:rPr>
+                                <w:rFonts w:ascii="Consolas" w:hAnsi="Consolas" w:cs="Consolas"/>
+                              </w:rPr>
+                              <w:t>tileX</w:t>
+                            </w:r>
+                            <w:proofErr w:type="spellEnd"/>
+                            <w:r>
+                              <w:rPr>
+                                <w:rFonts w:ascii="Consolas" w:hAnsi="Consolas" w:cs="Consolas"/>
+                              </w:rPr>
+                              <w:t xml:space="preserve">, </w:t>
+                            </w:r>
+                            <w:proofErr w:type="spellStart"/>
+                            <w:r>
+                              <w:rPr>
+                                <w:rFonts w:ascii="Consolas" w:hAnsi="Consolas" w:cs="Consolas"/>
+                              </w:rPr>
+                              <w:t>tileY</w:t>
+                            </w:r>
+                            <w:proofErr w:type="spellEnd"/>
+                            <w:r>
+                              <w:rPr>
+                                <w:rFonts w:ascii="Consolas" w:hAnsi="Consolas" w:cs="Consolas"/>
+                              </w:rPr>
+                              <w:t>) == (</w:t>
+                            </w:r>
+                            <w:proofErr w:type="spellStart"/>
+                            <w:proofErr w:type="gramStart"/>
+                            <w:r>
+                              <w:rPr>
+                                <w:rFonts w:ascii="Consolas" w:hAnsi="Consolas" w:cs="Consolas"/>
+                              </w:rPr>
+                              <w:t>turret.tileX</w:t>
+                            </w:r>
+                            <w:proofErr w:type="spellEnd"/>
+                            <w:proofErr w:type="gramEnd"/>
+                            <w:r>
+                              <w:rPr>
+                                <w:rFonts w:ascii="Consolas" w:hAnsi="Consolas" w:cs="Consolas"/>
+                              </w:rPr>
+                              <w:t xml:space="preserve">, </w:t>
+                            </w:r>
+                            <w:proofErr w:type="spellStart"/>
+                            <w:r>
+                              <w:rPr>
+                                <w:rFonts w:ascii="Consolas" w:hAnsi="Consolas" w:cs="Consolas"/>
+                              </w:rPr>
+                              <w:t>turret.tileY</w:t>
+                            </w:r>
+                            <w:proofErr w:type="spellEnd"/>
+                            <w:r>
+                              <w:rPr>
+                                <w:rFonts w:ascii="Consolas" w:hAnsi="Consolas" w:cs="Consolas"/>
+                              </w:rPr>
+                              <w:t xml:space="preserve">) </w:t>
+                            </w:r>
+                            <w:r>
+                              <w:rPr>
+                                <w:rFonts w:ascii="Consolas" w:hAnsi="Consolas" w:cs="Consolas"/>
+                              </w:rPr>
+                              <w:t>THEN</w:t>
                             </w:r>
                           </w:p>
                           <w:p>
                             <w:pPr>
-                              <w:ind w:left="1440" w:firstLine="720"/>
+                              <w:ind w:left="2160" w:firstLine="720"/>
                               <w:rPr>
                                 <w:rFonts w:ascii="Consolas" w:hAnsi="Consolas" w:cs="Consolas"/>
                               </w:rPr>
                             </w:pPr>
-                            <w:r>
-                              <w:rPr>
-                                <w:rFonts w:ascii="Consolas" w:hAnsi="Consolas" w:cs="Consolas"/>
-                              </w:rPr>
-                              <w:t>tileFree = False</w:t>
+                            <w:proofErr w:type="spellStart"/>
+                            <w:r>
+                              <w:rPr>
+                                <w:rFonts w:ascii="Consolas" w:hAnsi="Consolas" w:cs="Consolas"/>
+                              </w:rPr>
+                              <w:t>tileFree</w:t>
+                            </w:r>
+                            <w:proofErr w:type="spellEnd"/>
+                            <w:r>
+                              <w:rPr>
+                                <w:rFonts w:ascii="Consolas" w:hAnsi="Consolas" w:cs="Consolas"/>
+                              </w:rPr>
+                              <w:t xml:space="preserve"> = False</w:t>
                             </w:r>
                           </w:p>
                           <w:p>
@@ -6620,8 +6936,16 @@
                               <w:rPr>
                                 <w:rFonts w:ascii="Consolas" w:hAnsi="Consolas" w:cs="Consolas"/>
                               </w:rPr>
-                              <w:t xml:space="preserve"> tileFree</w:t>
-                            </w:r>
+                              <w:t xml:space="preserve"> </w:t>
+                            </w:r>
+                            <w:proofErr w:type="spellStart"/>
+                            <w:r>
+                              <w:rPr>
+                                <w:rFonts w:ascii="Consolas" w:hAnsi="Consolas" w:cs="Consolas"/>
+                              </w:rPr>
+                              <w:t>tileFree</w:t>
+                            </w:r>
+                            <w:proofErr w:type="spellEnd"/>
                             <w:r>
                               <w:rPr>
                                 <w:rFonts w:ascii="Consolas" w:hAnsi="Consolas" w:cs="Consolas"/>
@@ -6641,7 +6965,21 @@
                                 <w:rFonts w:ascii="Consolas" w:hAnsi="Consolas" w:cs="Consolas"/>
                               </w:rPr>
                               <w:tab/>
-                              <w:t>IF turretType == “cannon” THEN</w:t>
+                              <w:t xml:space="preserve">IF </w:t>
+                            </w:r>
+                            <w:proofErr w:type="spellStart"/>
+                            <w:r>
+                              <w:rPr>
+                                <w:rFonts w:ascii="Consolas" w:hAnsi="Consolas" w:cs="Consolas"/>
+                              </w:rPr>
+                              <w:t>turretType</w:t>
+                            </w:r>
+                            <w:proofErr w:type="spellEnd"/>
+                            <w:r>
+                              <w:rPr>
+                                <w:rFonts w:ascii="Consolas" w:hAnsi="Consolas" w:cs="Consolas"/>
+                              </w:rPr>
+                              <w:t xml:space="preserve"> == “cannon” THEN</w:t>
                             </w:r>
                           </w:p>
                           <w:p>
@@ -6651,12 +6989,21 @@
                                 <w:rFonts w:ascii="Consolas" w:hAnsi="Consolas" w:cs="Consolas"/>
                               </w:rPr>
                             </w:pPr>
-                            <w:r>
-                              <w:rPr>
-                                <w:rFonts w:ascii="Consolas" w:hAnsi="Consolas" w:cs="Consolas"/>
-                              </w:rPr>
-                              <w:t xml:space="preserve">newTurret = </w:t>
-                            </w:r>
+                            <w:proofErr w:type="spellStart"/>
+                            <w:r>
+                              <w:rPr>
+                                <w:rFonts w:ascii="Consolas" w:hAnsi="Consolas" w:cs="Consolas"/>
+                              </w:rPr>
+                              <w:t>newTurret</w:t>
+                            </w:r>
+                            <w:proofErr w:type="spellEnd"/>
+                            <w:r>
+                              <w:rPr>
+                                <w:rFonts w:ascii="Consolas" w:hAnsi="Consolas" w:cs="Consolas"/>
+                              </w:rPr>
+                              <w:t xml:space="preserve"> = </w:t>
+                            </w:r>
+                            <w:proofErr w:type="gramStart"/>
                             <w:r>
                               <w:rPr>
                                 <w:rFonts w:ascii="Consolas" w:hAnsi="Consolas" w:cs="Consolas"/>
@@ -6667,14 +7014,71 @@
                               <w:rPr>
                                 <w:rFonts w:ascii="Consolas" w:hAnsi="Consolas" w:cs="Consolas"/>
                               </w:rPr>
-                              <w:t>(tileX, tileY)</w:t>
+                              <w:t>(</w:t>
+                            </w:r>
+                            <w:proofErr w:type="spellStart"/>
+                            <w:proofErr w:type="gramEnd"/>
+                            <w:r>
+                              <w:rPr>
+                                <w:rFonts w:ascii="Consolas" w:hAnsi="Consolas" w:cs="Consolas"/>
+                              </w:rPr>
+                              <w:t>tileX</w:t>
+                            </w:r>
+                            <w:proofErr w:type="spellEnd"/>
+                            <w:r>
+                              <w:rPr>
+                                <w:rFonts w:ascii="Consolas" w:hAnsi="Consolas" w:cs="Consolas"/>
+                              </w:rPr>
+                              <w:t xml:space="preserve">, </w:t>
+                            </w:r>
+                            <w:proofErr w:type="spellStart"/>
+                            <w:r>
+                              <w:rPr>
+                                <w:rFonts w:ascii="Consolas" w:hAnsi="Consolas" w:cs="Consolas"/>
+                              </w:rPr>
+                              <w:t>tileY</w:t>
+                            </w:r>
+                            <w:proofErr w:type="spellEnd"/>
+                            <w:r>
+                              <w:rPr>
+                                <w:rFonts w:ascii="Consolas" w:hAnsi="Consolas" w:cs="Consolas"/>
+                              </w:rPr>
+                              <w:t>)</w:t>
                             </w:r>
                             <w:r>
                               <w:rPr>
                                 <w:rFonts w:ascii="Consolas" w:hAnsi="Consolas" w:cs="Consolas"/>
                               </w:rPr>
                               <w:br/>
-                              <w:t>ELSE IF turretType == “machinelaser” THEN</w:t>
+                              <w:t xml:space="preserve">ELSE IF </w:t>
+                            </w:r>
+                            <w:proofErr w:type="spellStart"/>
+                            <w:r>
+                              <w:rPr>
+                                <w:rFonts w:ascii="Consolas" w:hAnsi="Consolas" w:cs="Consolas"/>
+                              </w:rPr>
+                              <w:t>turretType</w:t>
+                            </w:r>
+                            <w:proofErr w:type="spellEnd"/>
+                            <w:r>
+                              <w:rPr>
+                                <w:rFonts w:ascii="Consolas" w:hAnsi="Consolas" w:cs="Consolas"/>
+                              </w:rPr>
+                              <w:t xml:space="preserve"> == “</w:t>
+                            </w:r>
+                            <w:proofErr w:type="spellStart"/>
+                            <w:r>
+                              <w:rPr>
+                                <w:rFonts w:ascii="Consolas" w:hAnsi="Consolas" w:cs="Consolas"/>
+                              </w:rPr>
+                              <w:t>machinelaser</w:t>
+                            </w:r>
+                            <w:proofErr w:type="spellEnd"/>
+                            <w:r>
+                              <w:rPr>
+                                <w:rFonts w:ascii="Consolas" w:hAnsi="Consolas" w:cs="Consolas"/>
+                              </w:rPr>
+                              <w:t>” THEN</w:t>
                             </w:r>
                           </w:p>
                           <w:p>
@@ -6684,23 +7088,63 @@
                                 <w:rFonts w:ascii="Consolas" w:hAnsi="Consolas" w:cs="Consolas"/>
                               </w:rPr>
                             </w:pPr>
-                            <w:r>
-                              <w:rPr>
-                                <w:rFonts w:ascii="Consolas" w:hAnsi="Consolas" w:cs="Consolas"/>
-                              </w:rPr>
-                              <w:t xml:space="preserve">newTurret = </w:t>
-                            </w:r>
+                            <w:proofErr w:type="spellStart"/>
+                            <w:r>
+                              <w:rPr>
+                                <w:rFonts w:ascii="Consolas" w:hAnsi="Consolas" w:cs="Consolas"/>
+                              </w:rPr>
+                              <w:t>newTurret</w:t>
+                            </w:r>
+                            <w:proofErr w:type="spellEnd"/>
+                            <w:r>
+                              <w:rPr>
+                                <w:rFonts w:ascii="Consolas" w:hAnsi="Consolas" w:cs="Consolas"/>
+                              </w:rPr>
+                              <w:t xml:space="preserve"> = </w:t>
+                            </w:r>
+                            <w:proofErr w:type="spellStart"/>
+                            <w:proofErr w:type="gramStart"/>
                             <w:r>
                               <w:rPr>
                                 <w:rFonts w:ascii="Consolas" w:hAnsi="Consolas" w:cs="Consolas"/>
                               </w:rPr>
                               <w:t>Machinelaser</w:t>
                             </w:r>
-                            <w:r>
-                              <w:rPr>
-                                <w:rFonts w:ascii="Consolas" w:hAnsi="Consolas" w:cs="Consolas"/>
-                              </w:rPr>
-                              <w:t>(tileX, tileY)</w:t>
+                            <w:proofErr w:type="spellEnd"/>
+                            <w:r>
+                              <w:rPr>
+                                <w:rFonts w:ascii="Consolas" w:hAnsi="Consolas" w:cs="Consolas"/>
+                              </w:rPr>
+                              <w:t>(</w:t>
+                            </w:r>
+                            <w:proofErr w:type="spellStart"/>
+                            <w:proofErr w:type="gramEnd"/>
+                            <w:r>
+                              <w:rPr>
+                                <w:rFonts w:ascii="Consolas" w:hAnsi="Consolas" w:cs="Consolas"/>
+                              </w:rPr>
+                              <w:t>tileX</w:t>
+                            </w:r>
+                            <w:proofErr w:type="spellEnd"/>
+                            <w:r>
+                              <w:rPr>
+                                <w:rFonts w:ascii="Consolas" w:hAnsi="Consolas" w:cs="Consolas"/>
+                              </w:rPr>
+                              <w:t xml:space="preserve">, </w:t>
+                            </w:r>
+                            <w:proofErr w:type="spellStart"/>
+                            <w:r>
+                              <w:rPr>
+                                <w:rFonts w:ascii="Consolas" w:hAnsi="Consolas" w:cs="Consolas"/>
+                              </w:rPr>
+                              <w:t>tileY</w:t>
+                            </w:r>
+                            <w:proofErr w:type="spellEnd"/>
+                            <w:r>
+                              <w:rPr>
+                                <w:rFonts w:ascii="Consolas" w:hAnsi="Consolas" w:cs="Consolas"/>
+                              </w:rPr>
+                              <w:t>)</w:t>
                             </w:r>
                           </w:p>
                           <w:p>
@@ -6753,7 +7197,37 @@
                               <w:rPr>
                                 <w:rFonts w:ascii="Consolas" w:hAnsi="Consolas" w:cs="Consolas"/>
                               </w:rPr>
-                              <w:t xml:space="preserve"> world.money - newTurret.cost &gt;= 0</w:t>
+                              <w:t xml:space="preserve"> </w:t>
+                            </w:r>
+                            <w:proofErr w:type="spellStart"/>
+                            <w:proofErr w:type="gramStart"/>
+                            <w:r>
+                              <w:rPr>
+                                <w:rFonts w:ascii="Consolas" w:hAnsi="Consolas" w:cs="Consolas"/>
+                              </w:rPr>
+                              <w:t>world.money</w:t>
+                            </w:r>
+                            <w:proofErr w:type="spellEnd"/>
+                            <w:proofErr w:type="gramEnd"/>
+                            <w:r>
+                              <w:rPr>
+                                <w:rFonts w:ascii="Consolas" w:hAnsi="Consolas" w:cs="Consolas"/>
+                              </w:rPr>
+                              <w:t xml:space="preserve"> - </w:t>
+                            </w:r>
+                            <w:proofErr w:type="spellStart"/>
+                            <w:r>
+                              <w:rPr>
+                                <w:rFonts w:ascii="Consolas" w:hAnsi="Consolas" w:cs="Consolas"/>
+                              </w:rPr>
+                              <w:t>newTurret.cost</w:t>
+                            </w:r>
+                            <w:proofErr w:type="spellEnd"/>
+                            <w:r>
+                              <w:rPr>
+                                <w:rFonts w:ascii="Consolas" w:hAnsi="Consolas" w:cs="Consolas"/>
+                              </w:rPr>
+                              <w:t xml:space="preserve"> &gt;= 0</w:t>
                             </w:r>
                             <w:r>
                               <w:rPr>
@@ -6769,11 +7243,33 @@
                                 <w:rFonts w:ascii="Consolas" w:hAnsi="Consolas" w:cs="Consolas"/>
                               </w:rPr>
                             </w:pPr>
-                            <w:r>
-                              <w:rPr>
-                                <w:rFonts w:ascii="Consolas" w:hAnsi="Consolas" w:cs="Consolas"/>
-                              </w:rPr>
-                              <w:t>allTurretsGroup.add(newTurret)</w:t>
+                            <w:proofErr w:type="spellStart"/>
+                            <w:r>
+                              <w:rPr>
+                                <w:rFonts w:ascii="Consolas" w:hAnsi="Consolas" w:cs="Consolas"/>
+                              </w:rPr>
+                              <w:t>allTurretsGroup.add</w:t>
+                            </w:r>
+                            <w:proofErr w:type="spellEnd"/>
+                            <w:r>
+                              <w:rPr>
+                                <w:rFonts w:ascii="Consolas" w:hAnsi="Consolas" w:cs="Consolas"/>
+                              </w:rPr>
+                              <w:t>(</w:t>
+                            </w:r>
+                            <w:proofErr w:type="spellStart"/>
+                            <w:r>
+                              <w:rPr>
+                                <w:rFonts w:ascii="Consolas" w:hAnsi="Consolas" w:cs="Consolas"/>
+                              </w:rPr>
+                              <w:t>newTurret</w:t>
+                            </w:r>
+                            <w:proofErr w:type="spellEnd"/>
+                            <w:r>
+                              <w:rPr>
+                                <w:rFonts w:ascii="Consolas" w:hAnsi="Consolas" w:cs="Consolas"/>
+                              </w:rPr>
+                              <w:t>)</w:t>
                             </w:r>
                           </w:p>
                           <w:p>
@@ -6783,11 +7279,56 @@
                                 <w:rFonts w:ascii="Consolas" w:hAnsi="Consolas" w:cs="Consolas"/>
                               </w:rPr>
                             </w:pPr>
-                            <w:r>
-                              <w:rPr>
-                                <w:rFonts w:ascii="Consolas" w:hAnsi="Consolas" w:cs="Consolas"/>
-                              </w:rPr>
-                              <w:t>world.money -= newTurret.cost</w:t>
+                            <w:proofErr w:type="spellStart"/>
+                            <w:proofErr w:type="gramStart"/>
+                            <w:r>
+                              <w:rPr>
+                                <w:rFonts w:ascii="Consolas" w:hAnsi="Consolas" w:cs="Consolas"/>
+                              </w:rPr>
+                              <w:t>world.money</w:t>
+                            </w:r>
+                            <w:proofErr w:type="spellEnd"/>
+                            <w:proofErr w:type="gramEnd"/>
+                            <w:r>
+                              <w:rPr>
+                                <w:rFonts w:ascii="Consolas" w:hAnsi="Consolas" w:cs="Consolas"/>
+                              </w:rPr>
+                              <w:t xml:space="preserve"> -= </w:t>
+                            </w:r>
+                            <w:proofErr w:type="spellStart"/>
+                            <w:r>
+                              <w:rPr>
+                                <w:rFonts w:ascii="Consolas" w:hAnsi="Consolas" w:cs="Consolas"/>
+                              </w:rPr>
+                              <w:t>newTurret.cost</w:t>
+                            </w:r>
+                            <w:proofErr w:type="spellEnd"/>
+                            <w:r>
+                              <w:rPr>
+                                <w:rFonts w:ascii="Consolas" w:hAnsi="Consolas" w:cs="Consolas"/>
+                              </w:rPr>
+                              <w:br/>
+                              <w:t>END IF</w:t>
+                            </w:r>
+                          </w:p>
+                          <w:p>
+                            <w:pPr>
+                              <w:rPr>
+                                <w:rFonts w:ascii="Consolas" w:hAnsi="Consolas" w:cs="Consolas"/>
+                              </w:rPr>
+                            </w:pPr>
+                            <w:r>
+                              <w:rPr>
+                                <w:rFonts w:ascii="Consolas" w:hAnsi="Consolas" w:cs="Consolas"/>
+                              </w:rPr>
+                              <w:tab/>
+                            </w:r>
+                            <w:r>
+                              <w:rPr>
+                                <w:rFonts w:ascii="Consolas" w:hAnsi="Consolas" w:cs="Consolas"/>
+                              </w:rPr>
+                              <w:tab/>
+                              <w:t>END IF</w:t>
                             </w:r>
                           </w:p>
                           <w:p>
@@ -6836,8 +7377,16 @@
                               <w:rPr>
                                 <w:rFonts w:ascii="Consolas" w:hAnsi="Consolas" w:cs="Consolas"/>
                               </w:rPr>
-                              <w:t>return allTurretsGroup</w:t>
-                            </w:r>
+                              <w:t xml:space="preserve">return </w:t>
+                            </w:r>
+                            <w:proofErr w:type="spellStart"/>
+                            <w:r>
+                              <w:rPr>
+                                <w:rFonts w:ascii="Consolas" w:hAnsi="Consolas" w:cs="Consolas"/>
+                              </w:rPr>
+                              <w:t>allTurretsGroup</w:t>
+                            </w:r>
+                            <w:proofErr w:type="spellEnd"/>
                           </w:p>
                           <w:p>
                             <w:pPr>
@@ -6851,12 +7400,14 @@
                             <w:r>
                               <w:t xml:space="preserve">END </w:t>
                             </w:r>
+                            <w:proofErr w:type="spellStart"/>
                             <w:r>
                               <w:rPr>
                                 <w:rFonts w:ascii="Consolas" w:hAnsi="Consolas" w:cs="Consolas"/>
                               </w:rPr>
                               <w:t>createTurret</w:t>
                             </w:r>
+                            <w:proofErr w:type="spellEnd"/>
                           </w:p>
                         </w:txbxContent>
                       </wps:txbx>
@@ -6884,7 +7435,7 @@
                 <v:stroke joinstyle="miter"/>
                 <v:path gradientshapeok="t" o:connecttype="rect"/>
               </v:shapetype>
-              <v:shape id="Text Box 1" o:spid="_x0000_s1026" type="#_x0000_t202" style="position:absolute;margin-left:3.4pt;margin-top:8.2pt;width:515.4pt;height:346.9pt;z-index:251659264;visibility:visible;mso-wrap-style:square;mso-width-percent:0;mso-height-percent:0;mso-wrap-distance-left:9pt;mso-wrap-distance-top:0;mso-wrap-distance-right:9pt;mso-wrap-distance-bottom:0;mso-position-horizontal:absolute;mso-position-horizontal-relative:text;mso-position-vertical:absolute;mso-position-vertical-relative:text;mso-width-percent:0;mso-height-percent:0;mso-width-relative:margin;mso-height-relative:margin;v-text-anchor:top" o:gfxdata="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" fillcolor="white [3201]" strokeweight=".5pt">
+              <v:shape id="Text Box 1" o:spid="_x0000_s1026" type="#_x0000_t202" style="position:absolute;margin-left:3.1pt;margin-top:7.75pt;width:515.4pt;height:445.95pt;z-index:251659264;visibility:visible;mso-wrap-style:square;mso-width-percent:0;mso-height-percent:0;mso-wrap-distance-left:9pt;mso-wrap-distance-top:0;mso-wrap-distance-right:9pt;mso-wrap-distance-bottom:0;mso-position-horizontal:absolute;mso-position-horizontal-relative:text;mso-position-vertical:absolute;mso-position-vertical-relative:text;mso-width-percent:0;mso-height-percent:0;mso-width-relative:margin;mso-height-relative:margin;v-text-anchor:top" o:gfxdata="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" fillcolor="white [3201]" strokeweight=".5pt">
                 <v:textbox>
                   <w:txbxContent>
                     <w:p>
@@ -6899,18 +7450,64 @@
                         </w:rPr>
                         <w:t xml:space="preserve">FUNCTION </w:t>
                       </w:r>
-                      <w:r>
-                        <w:rPr>
-                          <w:rFonts w:ascii="Consolas" w:hAnsi="Consolas" w:cs="Consolas"/>
-                        </w:rPr>
-                        <w:t>createTurret(mousePosition allTurretsGroup, world</w:t>
-                      </w:r>
-                      <w:r>
-                        <w:rPr>
-                          <w:rFonts w:ascii="Consolas" w:hAnsi="Consolas" w:cs="Consolas"/>
-                        </w:rPr>
-                        <w:t>, turretType</w:t>
-                      </w:r>
+                      <w:proofErr w:type="spellStart"/>
+                      <w:proofErr w:type="gramStart"/>
+                      <w:r>
+                        <w:rPr>
+                          <w:rFonts w:ascii="Consolas" w:hAnsi="Consolas" w:cs="Consolas"/>
+                        </w:rPr>
+                        <w:t>createTurret</w:t>
+                      </w:r>
+                      <w:proofErr w:type="spellEnd"/>
+                      <w:r>
+                        <w:rPr>
+                          <w:rFonts w:ascii="Consolas" w:hAnsi="Consolas" w:cs="Consolas"/>
+                        </w:rPr>
+                        <w:t>(</w:t>
+                      </w:r>
+                      <w:proofErr w:type="spellStart"/>
+                      <w:proofErr w:type="gramEnd"/>
+                      <w:r>
+                        <w:rPr>
+                          <w:rFonts w:ascii="Consolas" w:hAnsi="Consolas" w:cs="Consolas"/>
+                        </w:rPr>
+                        <w:t>mousePosition</w:t>
+                      </w:r>
+                      <w:proofErr w:type="spellEnd"/>
+                      <w:r>
+                        <w:rPr>
+                          <w:rFonts w:ascii="Consolas" w:hAnsi="Consolas" w:cs="Consolas"/>
+                        </w:rPr>
+                        <w:t xml:space="preserve"> </w:t>
+                      </w:r>
+                      <w:proofErr w:type="spellStart"/>
+                      <w:r>
+                        <w:rPr>
+                          <w:rFonts w:ascii="Consolas" w:hAnsi="Consolas" w:cs="Consolas"/>
+                        </w:rPr>
+                        <w:t>allTurretsGroup</w:t>
+                      </w:r>
+                      <w:proofErr w:type="spellEnd"/>
+                      <w:r>
+                        <w:rPr>
+                          <w:rFonts w:ascii="Consolas" w:hAnsi="Consolas" w:cs="Consolas"/>
+                        </w:rPr>
+                        <w:t>, world</w:t>
+                      </w:r>
+                      <w:r>
+                        <w:rPr>
+                          <w:rFonts w:ascii="Consolas" w:hAnsi="Consolas" w:cs="Consolas"/>
+                        </w:rPr>
+                        <w:t xml:space="preserve">, </w:t>
+                      </w:r>
+                      <w:proofErr w:type="spellStart"/>
+                      <w:r>
+                        <w:rPr>
+                          <w:rFonts w:ascii="Consolas" w:hAnsi="Consolas" w:cs="Consolas"/>
+                        </w:rPr>
+                        <w:t>turretType</w:t>
+                      </w:r>
+                      <w:proofErr w:type="spellEnd"/>
                       <w:r>
                         <w:rPr>
                           <w:rFonts w:ascii="Consolas" w:hAnsi="Consolas" w:cs="Consolas"/>
@@ -6925,11 +7522,41 @@
                           <w:rFonts w:ascii="Consolas" w:hAnsi="Consolas" w:cs="Consolas"/>
                         </w:rPr>
                       </w:pPr>
-                      <w:r>
-                        <w:rPr>
-                          <w:rFonts w:ascii="Consolas" w:hAnsi="Consolas" w:cs="Consolas"/>
-                        </w:rPr>
-                        <w:t>tileX = mousePosition[0] // TILE_SIZE</w:t>
+                      <w:proofErr w:type="spellStart"/>
+                      <w:r>
+                        <w:rPr>
+                          <w:rFonts w:ascii="Consolas" w:hAnsi="Consolas" w:cs="Consolas"/>
+                        </w:rPr>
+                        <w:t>tileX</w:t>
+                      </w:r>
+                      <w:proofErr w:type="spellEnd"/>
+                      <w:r>
+                        <w:rPr>
+                          <w:rFonts w:ascii="Consolas" w:hAnsi="Consolas" w:cs="Consolas"/>
+                        </w:rPr>
+                        <w:t xml:space="preserve"> = </w:t>
+                      </w:r>
+                      <w:proofErr w:type="spellStart"/>
+                      <w:proofErr w:type="gramStart"/>
+                      <w:r>
+                        <w:rPr>
+                          <w:rFonts w:ascii="Consolas" w:hAnsi="Consolas" w:cs="Consolas"/>
+                        </w:rPr>
+                        <w:t>mousePosition</w:t>
+                      </w:r>
+                      <w:proofErr w:type="spellEnd"/>
+                      <w:r>
+                        <w:rPr>
+                          <w:rFonts w:ascii="Consolas" w:hAnsi="Consolas" w:cs="Consolas"/>
+                        </w:rPr>
+                        <w:t>[</w:t>
+                      </w:r>
+                      <w:proofErr w:type="gramEnd"/>
+                      <w:r>
+                        <w:rPr>
+                          <w:rFonts w:ascii="Consolas" w:hAnsi="Consolas" w:cs="Consolas"/>
+                        </w:rPr>
+                        <w:t>0] // TILE_SIZE</w:t>
                       </w:r>
                     </w:p>
                     <w:p>
@@ -6939,11 +7566,41 @@
                           <w:rFonts w:ascii="Consolas" w:hAnsi="Consolas" w:cs="Consolas"/>
                         </w:rPr>
                       </w:pPr>
-                      <w:r>
-                        <w:rPr>
-                          <w:rFonts w:ascii="Consolas" w:hAnsi="Consolas" w:cs="Consolas"/>
-                        </w:rPr>
-                        <w:t>tileY = mousePosition[1] // TILE_SIZE</w:t>
+                      <w:proofErr w:type="spellStart"/>
+                      <w:r>
+                        <w:rPr>
+                          <w:rFonts w:ascii="Consolas" w:hAnsi="Consolas" w:cs="Consolas"/>
+                        </w:rPr>
+                        <w:t>tileY</w:t>
+                      </w:r>
+                      <w:proofErr w:type="spellEnd"/>
+                      <w:r>
+                        <w:rPr>
+                          <w:rFonts w:ascii="Consolas" w:hAnsi="Consolas" w:cs="Consolas"/>
+                        </w:rPr>
+                        <w:t xml:space="preserve"> = </w:t>
+                      </w:r>
+                      <w:proofErr w:type="spellStart"/>
+                      <w:proofErr w:type="gramStart"/>
+                      <w:r>
+                        <w:rPr>
+                          <w:rFonts w:ascii="Consolas" w:hAnsi="Consolas" w:cs="Consolas"/>
+                        </w:rPr>
+                        <w:t>mousePosition</w:t>
+                      </w:r>
+                      <w:proofErr w:type="spellEnd"/>
+                      <w:r>
+                        <w:rPr>
+                          <w:rFonts w:ascii="Consolas" w:hAnsi="Consolas" w:cs="Consolas"/>
+                        </w:rPr>
+                        <w:t>[</w:t>
+                      </w:r>
+                      <w:proofErr w:type="gramEnd"/>
+                      <w:r>
+                        <w:rPr>
+                          <w:rFonts w:ascii="Consolas" w:hAnsi="Consolas" w:cs="Consolas"/>
+                        </w:rPr>
+                        <w:t>1] // TILE_SIZE</w:t>
                       </w:r>
                     </w:p>
                     <w:p>
@@ -6953,12 +7610,42 @@
                           <w:rFonts w:ascii="Consolas" w:hAnsi="Consolas" w:cs="Consolas"/>
                         </w:rPr>
                       </w:pPr>
-                      <w:r>
-                        <w:rPr>
-                          <w:rFonts w:ascii="Consolas" w:hAnsi="Consolas" w:cs="Consolas"/>
-                        </w:rPr>
-                        <w:t>mouseTileNum = tileY * TILE_ROWS + tileX</w:t>
-                      </w:r>
+                      <w:proofErr w:type="spellStart"/>
+                      <w:r>
+                        <w:rPr>
+                          <w:rFonts w:ascii="Consolas" w:hAnsi="Consolas" w:cs="Consolas"/>
+                        </w:rPr>
+                        <w:t>mouseTileNum</w:t>
+                      </w:r>
+                      <w:proofErr w:type="spellEnd"/>
+                      <w:r>
+                        <w:rPr>
+                          <w:rFonts w:ascii="Consolas" w:hAnsi="Consolas" w:cs="Consolas"/>
+                        </w:rPr>
+                        <w:t xml:space="preserve"> = </w:t>
+                      </w:r>
+                      <w:proofErr w:type="spellStart"/>
+                      <w:r>
+                        <w:rPr>
+                          <w:rFonts w:ascii="Consolas" w:hAnsi="Consolas" w:cs="Consolas"/>
+                        </w:rPr>
+                        <w:t>tileY</w:t>
+                      </w:r>
+                      <w:proofErr w:type="spellEnd"/>
+                      <w:r>
+                        <w:rPr>
+                          <w:rFonts w:ascii="Consolas" w:hAnsi="Consolas" w:cs="Consolas"/>
+                        </w:rPr>
+                        <w:t xml:space="preserve"> * TILE_ROWS + </w:t>
+                      </w:r>
+                      <w:proofErr w:type="spellStart"/>
+                      <w:r>
+                        <w:rPr>
+                          <w:rFonts w:ascii="Consolas" w:hAnsi="Consolas" w:cs="Consolas"/>
+                        </w:rPr>
+                        <w:t>tileX</w:t>
+                      </w:r>
+                      <w:proofErr w:type="spellEnd"/>
                     </w:p>
                     <w:p>
                       <w:pPr>
@@ -6971,31 +7658,37 @@
                         <w:rPr>
                           <w:rFonts w:ascii="Consolas" w:hAnsi="Consolas" w:cs="Consolas"/>
                         </w:rPr>
-                        <w:t>IF</w:t>
-                      </w:r>
-                      <w:r>
-                        <w:rPr>
-                          <w:rFonts w:ascii="Consolas" w:hAnsi="Consolas" w:cs="Consolas"/>
-                        </w:rPr>
-                        <w:t xml:space="preserve"> world.tilemap[mouseTileNum] </w:t>
-                      </w:r>
-                      <w:r>
-                        <w:rPr>
-                          <w:rFonts w:ascii="Consolas" w:hAnsi="Consolas" w:cs="Consolas"/>
-                        </w:rPr>
-                        <w:t>IN</w:t>
-                      </w:r>
-                      <w:r>
-                        <w:rPr>
-                          <w:rFonts w:ascii="Consolas" w:hAnsi="Consolas" w:cs="Consolas"/>
-                        </w:rPr>
-                        <w:t xml:space="preserve"> GRASS_TILE_VALUES</w:t>
-                      </w:r>
-                      <w:r>
-                        <w:rPr>
-                          <w:rFonts w:ascii="Consolas" w:hAnsi="Consolas" w:cs="Consolas"/>
-                        </w:rPr>
-                        <w:t xml:space="preserve"> THEN</w:t>
+                        <w:t xml:space="preserve">IF </w:t>
+                      </w:r>
+                      <w:proofErr w:type="spellStart"/>
+                      <w:proofErr w:type="gramStart"/>
+                      <w:r>
+                        <w:rPr>
+                          <w:rFonts w:ascii="Consolas" w:hAnsi="Consolas" w:cs="Consolas"/>
+                        </w:rPr>
+                        <w:t>world.tilemap</w:t>
+                      </w:r>
+                      <w:proofErr w:type="spellEnd"/>
+                      <w:proofErr w:type="gramEnd"/>
+                      <w:r>
+                        <w:rPr>
+                          <w:rFonts w:ascii="Consolas" w:hAnsi="Consolas" w:cs="Consolas"/>
+                        </w:rPr>
+                        <w:t>[</w:t>
+                      </w:r>
+                      <w:proofErr w:type="spellStart"/>
+                      <w:r>
+                        <w:rPr>
+                          <w:rFonts w:ascii="Consolas" w:hAnsi="Consolas" w:cs="Consolas"/>
+                        </w:rPr>
+                        <w:t>mouseTileNum</w:t>
+                      </w:r>
+                      <w:proofErr w:type="spellEnd"/>
+                      <w:r>
+                        <w:rPr>
+                          <w:rFonts w:ascii="Consolas" w:hAnsi="Consolas" w:cs="Consolas"/>
+                        </w:rPr>
+                        <w:t>] IN GRASS_TILE_VALUES THEN</w:t>
                       </w:r>
                     </w:p>
                     <w:p>
@@ -7005,11 +7698,19 @@
                           <w:rFonts w:ascii="Consolas" w:hAnsi="Consolas" w:cs="Consolas"/>
                         </w:rPr>
                       </w:pPr>
-                      <w:r>
-                        <w:rPr>
-                          <w:rFonts w:ascii="Consolas" w:hAnsi="Consolas" w:cs="Consolas"/>
-                        </w:rPr>
-                        <w:t>tileFree = True</w:t>
+                      <w:proofErr w:type="spellStart"/>
+                      <w:r>
+                        <w:rPr>
+                          <w:rFonts w:ascii="Consolas" w:hAnsi="Consolas" w:cs="Consolas"/>
+                        </w:rPr>
+                        <w:t>tileFree</w:t>
+                      </w:r>
+                      <w:proofErr w:type="spellEnd"/>
+                      <w:r>
+                        <w:rPr>
+                          <w:rFonts w:ascii="Consolas" w:hAnsi="Consolas" w:cs="Consolas"/>
+                        </w:rPr>
+                        <w:t xml:space="preserve"> = True</w:t>
                       </w:r>
                     </w:p>
                     <w:p>
@@ -7031,26 +7732,16 @@
                         <w:rPr>
                           <w:rFonts w:ascii="Consolas" w:hAnsi="Consolas" w:cs="Consolas"/>
                         </w:rPr>
-                        <w:t>FOR</w:t>
-                      </w:r>
-                      <w:r>
-                        <w:rPr>
-                          <w:rFonts w:ascii="Consolas" w:hAnsi="Consolas" w:cs="Consolas"/>
-                        </w:rPr>
-                        <w:t xml:space="preserve"> turret </w:t>
-                      </w:r>
-                      <w:r>
-                        <w:rPr>
-                          <w:rFonts w:ascii="Consolas" w:hAnsi="Consolas" w:cs="Consolas"/>
-                        </w:rPr>
-                        <w:t>IN</w:t>
-                      </w:r>
-                      <w:r>
-                        <w:rPr>
-                          <w:rFonts w:ascii="Consolas" w:hAnsi="Consolas" w:cs="Consolas"/>
-                        </w:rPr>
-                        <w:t xml:space="preserve"> allTurretsGroup</w:t>
-                      </w:r>
+                        <w:t xml:space="preserve">FOR turret IN </w:t>
+                      </w:r>
+                      <w:proofErr w:type="spellStart"/>
+                      <w:r>
+                        <w:rPr>
+                          <w:rFonts w:ascii="Consolas" w:hAnsi="Consolas" w:cs="Consolas"/>
+                        </w:rPr>
+                        <w:t>allTurretsGroup</w:t>
+                      </w:r>
+                      <w:proofErr w:type="spellEnd"/>
                       <w:r>
                         <w:rPr>
                           <w:rFonts w:ascii="Consolas" w:hAnsi="Consolas" w:cs="Consolas"/>
@@ -7069,33 +7760,93 @@
                         <w:rPr>
                           <w:rFonts w:ascii="Consolas" w:hAnsi="Consolas" w:cs="Consolas"/>
                         </w:rPr>
-                        <w:t>IF</w:t>
-                      </w:r>
-                      <w:r>
-                        <w:rPr>
-                          <w:rFonts w:ascii="Consolas" w:hAnsi="Consolas" w:cs="Consolas"/>
-                        </w:rPr>
-                        <w:t xml:space="preserve"> (tileX, tileY) == (turret.tileX, turret.tileY</w:t>
-                      </w:r>
-                      <w:r>
-                        <w:rPr>
-                          <w:rFonts w:ascii="Consolas" w:hAnsi="Consolas" w:cs="Consolas"/>
-                        </w:rPr>
-                        <w:t xml:space="preserve"> THEN</w:t>
+                        <w:t>IF (</w:t>
+                      </w:r>
+                      <w:proofErr w:type="spellStart"/>
+                      <w:r>
+                        <w:rPr>
+                          <w:rFonts w:ascii="Consolas" w:hAnsi="Consolas" w:cs="Consolas"/>
+                        </w:rPr>
+                        <w:t>tileX</w:t>
+                      </w:r>
+                      <w:proofErr w:type="spellEnd"/>
+                      <w:r>
+                        <w:rPr>
+                          <w:rFonts w:ascii="Consolas" w:hAnsi="Consolas" w:cs="Consolas"/>
+                        </w:rPr>
+                        <w:t xml:space="preserve">, </w:t>
+                      </w:r>
+                      <w:proofErr w:type="spellStart"/>
+                      <w:r>
+                        <w:rPr>
+                          <w:rFonts w:ascii="Consolas" w:hAnsi="Consolas" w:cs="Consolas"/>
+                        </w:rPr>
+                        <w:t>tileY</w:t>
+                      </w:r>
+                      <w:proofErr w:type="spellEnd"/>
+                      <w:r>
+                        <w:rPr>
+                          <w:rFonts w:ascii="Consolas" w:hAnsi="Consolas" w:cs="Consolas"/>
+                        </w:rPr>
+                        <w:t>) == (</w:t>
+                      </w:r>
+                      <w:proofErr w:type="spellStart"/>
+                      <w:proofErr w:type="gramStart"/>
+                      <w:r>
+                        <w:rPr>
+                          <w:rFonts w:ascii="Consolas" w:hAnsi="Consolas" w:cs="Consolas"/>
+                        </w:rPr>
+                        <w:t>turret.tileX</w:t>
+                      </w:r>
+                      <w:proofErr w:type="spellEnd"/>
+                      <w:proofErr w:type="gramEnd"/>
+                      <w:r>
+                        <w:rPr>
+                          <w:rFonts w:ascii="Consolas" w:hAnsi="Consolas" w:cs="Consolas"/>
+                        </w:rPr>
+                        <w:t xml:space="preserve">, </w:t>
+                      </w:r>
+                      <w:proofErr w:type="spellStart"/>
+                      <w:r>
+                        <w:rPr>
+                          <w:rFonts w:ascii="Consolas" w:hAnsi="Consolas" w:cs="Consolas"/>
+                        </w:rPr>
+                        <w:t>turret.tileY</w:t>
+                      </w:r>
+                      <w:proofErr w:type="spellEnd"/>
+                      <w:r>
+                        <w:rPr>
+                          <w:rFonts w:ascii="Consolas" w:hAnsi="Consolas" w:cs="Consolas"/>
+                        </w:rPr>
+                        <w:t xml:space="preserve">) </w:t>
+                      </w:r>
+                      <w:r>
+                        <w:rPr>
+                          <w:rFonts w:ascii="Consolas" w:hAnsi="Consolas" w:cs="Consolas"/>
+                        </w:rPr>
+                        <w:t>THEN</w:t>
                       </w:r>
                     </w:p>
                     <w:p>
                       <w:pPr>
-                        <w:ind w:left="1440" w:firstLine="720"/>
+                        <w:ind w:left="2160" w:firstLine="720"/>
                         <w:rPr>
                           <w:rFonts w:ascii="Consolas" w:hAnsi="Consolas" w:cs="Consolas"/>
                         </w:rPr>
                       </w:pPr>
-                      <w:r>
-                        <w:rPr>
-                          <w:rFonts w:ascii="Consolas" w:hAnsi="Consolas" w:cs="Consolas"/>
-                        </w:rPr>
-                        <w:t>tileFree = False</w:t>
+                      <w:proofErr w:type="spellStart"/>
+                      <w:r>
+                        <w:rPr>
+                          <w:rFonts w:ascii="Consolas" w:hAnsi="Consolas" w:cs="Consolas"/>
+                        </w:rPr>
+                        <w:t>tileFree</w:t>
+                      </w:r>
+                      <w:proofErr w:type="spellEnd"/>
+                      <w:r>
+                        <w:rPr>
+                          <w:rFonts w:ascii="Consolas" w:hAnsi="Consolas" w:cs="Consolas"/>
+                        </w:rPr>
+                        <w:t xml:space="preserve"> = False</w:t>
                       </w:r>
                     </w:p>
                     <w:p>
@@ -7188,8 +7939,16 @@
                         <w:rPr>
                           <w:rFonts w:ascii="Consolas" w:hAnsi="Consolas" w:cs="Consolas"/>
                         </w:rPr>
-                        <w:t xml:space="preserve"> tileFree</w:t>
-                      </w:r>
+                        <w:t xml:space="preserve"> </w:t>
+                      </w:r>
+                      <w:proofErr w:type="spellStart"/>
+                      <w:r>
+                        <w:rPr>
+                          <w:rFonts w:ascii="Consolas" w:hAnsi="Consolas" w:cs="Consolas"/>
+                        </w:rPr>
+                        <w:t>tileFree</w:t>
+                      </w:r>
+                      <w:proofErr w:type="spellEnd"/>
                       <w:r>
                         <w:rPr>
                           <w:rFonts w:ascii="Consolas" w:hAnsi="Consolas" w:cs="Consolas"/>
@@ -7209,7 +7968,21 @@
                           <w:rFonts w:ascii="Consolas" w:hAnsi="Consolas" w:cs="Consolas"/>
                         </w:rPr>
                         <w:tab/>
-                        <w:t>IF turretType == “cannon” THEN</w:t>
+                        <w:t xml:space="preserve">IF </w:t>
+                      </w:r>
+                      <w:proofErr w:type="spellStart"/>
+                      <w:r>
+                        <w:rPr>
+                          <w:rFonts w:ascii="Consolas" w:hAnsi="Consolas" w:cs="Consolas"/>
+                        </w:rPr>
+                        <w:t>turretType</w:t>
+                      </w:r>
+                      <w:proofErr w:type="spellEnd"/>
+                      <w:r>
+                        <w:rPr>
+                          <w:rFonts w:ascii="Consolas" w:hAnsi="Consolas" w:cs="Consolas"/>
+                        </w:rPr>
+                        <w:t xml:space="preserve"> == “cannon” THEN</w:t>
                       </w:r>
                     </w:p>
                     <w:p>
@@ -7219,12 +7992,21 @@
                           <w:rFonts w:ascii="Consolas" w:hAnsi="Consolas" w:cs="Consolas"/>
                         </w:rPr>
                       </w:pPr>
-                      <w:r>
-                        <w:rPr>
-                          <w:rFonts w:ascii="Consolas" w:hAnsi="Consolas" w:cs="Consolas"/>
-                        </w:rPr>
-                        <w:t xml:space="preserve">newTurret = </w:t>
-                      </w:r>
+                      <w:proofErr w:type="spellStart"/>
+                      <w:r>
+                        <w:rPr>
+                          <w:rFonts w:ascii="Consolas" w:hAnsi="Consolas" w:cs="Consolas"/>
+                        </w:rPr>
+                        <w:t>newTurret</w:t>
+                      </w:r>
+                      <w:proofErr w:type="spellEnd"/>
+                      <w:r>
+                        <w:rPr>
+                          <w:rFonts w:ascii="Consolas" w:hAnsi="Consolas" w:cs="Consolas"/>
+                        </w:rPr>
+                        <w:t xml:space="preserve"> = </w:t>
+                      </w:r>
+                      <w:proofErr w:type="gramStart"/>
                       <w:r>
                         <w:rPr>
                           <w:rFonts w:ascii="Consolas" w:hAnsi="Consolas" w:cs="Consolas"/>
@@ -7235,7 +8017,36 @@
                         <w:rPr>
                           <w:rFonts w:ascii="Consolas" w:hAnsi="Consolas" w:cs="Consolas"/>
                         </w:rPr>
-                        <w:t>(tileX, tileY)</w:t>
+                        <w:t>(</w:t>
+                      </w:r>
+                      <w:proofErr w:type="spellStart"/>
+                      <w:proofErr w:type="gramEnd"/>
+                      <w:r>
+                        <w:rPr>
+                          <w:rFonts w:ascii="Consolas" w:hAnsi="Consolas" w:cs="Consolas"/>
+                        </w:rPr>
+                        <w:t>tileX</w:t>
+                      </w:r>
+                      <w:proofErr w:type="spellEnd"/>
+                      <w:r>
+                        <w:rPr>
+                          <w:rFonts w:ascii="Consolas" w:hAnsi="Consolas" w:cs="Consolas"/>
+                        </w:rPr>
+                        <w:t xml:space="preserve">, </w:t>
+                      </w:r>
+                      <w:proofErr w:type="spellStart"/>
+                      <w:r>
+                        <w:rPr>
+                          <w:rFonts w:ascii="Consolas" w:hAnsi="Consolas" w:cs="Consolas"/>
+                        </w:rPr>
+                        <w:t>tileY</w:t>
+                      </w:r>
+                      <w:proofErr w:type="spellEnd"/>
+                      <w:r>
+                        <w:rPr>
+                          <w:rFonts w:ascii="Consolas" w:hAnsi="Consolas" w:cs="Consolas"/>
+                        </w:rPr>
+                        <w:t>)</w:t>
                       </w:r>
                       <w:r>
                         <w:rPr>
@@ -7244,18 +8055,28 @@
                         <w:br/>
                         <w:t xml:space="preserve">ELSE IF </w:t>
                       </w:r>
-                      <w:r>
-                        <w:rPr>
-                          <w:rFonts w:ascii="Consolas" w:hAnsi="Consolas" w:cs="Consolas"/>
-                        </w:rPr>
-                        <w:t>turretType == “</w:t>
-                      </w:r>
+                      <w:proofErr w:type="spellStart"/>
+                      <w:r>
+                        <w:rPr>
+                          <w:rFonts w:ascii="Consolas" w:hAnsi="Consolas" w:cs="Consolas"/>
+                        </w:rPr>
+                        <w:t>turretType</w:t>
+                      </w:r>
+                      <w:proofErr w:type="spellEnd"/>
+                      <w:r>
+                        <w:rPr>
+                          <w:rFonts w:ascii="Consolas" w:hAnsi="Consolas" w:cs="Consolas"/>
+                        </w:rPr>
+                        <w:t xml:space="preserve"> == “</w:t>
+                      </w:r>
+                      <w:proofErr w:type="spellStart"/>
                       <w:r>
                         <w:rPr>
                           <w:rFonts w:ascii="Consolas" w:hAnsi="Consolas" w:cs="Consolas"/>
                         </w:rPr>
                         <w:t>machinelaser</w:t>
                       </w:r>
+                      <w:proofErr w:type="spellEnd"/>
                       <w:r>
                         <w:rPr>
                           <w:rFonts w:ascii="Consolas" w:hAnsi="Consolas" w:cs="Consolas"/>
@@ -7270,23 +8091,63 @@
                           <w:rFonts w:ascii="Consolas" w:hAnsi="Consolas" w:cs="Consolas"/>
                         </w:rPr>
                       </w:pPr>
-                      <w:r>
-                        <w:rPr>
-                          <w:rFonts w:ascii="Consolas" w:hAnsi="Consolas" w:cs="Consolas"/>
-                        </w:rPr>
-                        <w:t xml:space="preserve">newTurret = </w:t>
-                      </w:r>
+                      <w:proofErr w:type="spellStart"/>
+                      <w:r>
+                        <w:rPr>
+                          <w:rFonts w:ascii="Consolas" w:hAnsi="Consolas" w:cs="Consolas"/>
+                        </w:rPr>
+                        <w:t>newTurret</w:t>
+                      </w:r>
+                      <w:proofErr w:type="spellEnd"/>
+                      <w:r>
+                        <w:rPr>
+                          <w:rFonts w:ascii="Consolas" w:hAnsi="Consolas" w:cs="Consolas"/>
+                        </w:rPr>
+                        <w:t xml:space="preserve"> = </w:t>
+                      </w:r>
+                      <w:proofErr w:type="spellStart"/>
+                      <w:proofErr w:type="gramStart"/>
                       <w:r>
                         <w:rPr>
                           <w:rFonts w:ascii="Consolas" w:hAnsi="Consolas" w:cs="Consolas"/>
                         </w:rPr>
                         <w:t>Machinelaser</w:t>
                       </w:r>
-                      <w:r>
-                        <w:rPr>
-                          <w:rFonts w:ascii="Consolas" w:hAnsi="Consolas" w:cs="Consolas"/>
-                        </w:rPr>
-                        <w:t>(tileX, tileY)</w:t>
+                      <w:proofErr w:type="spellEnd"/>
+                      <w:r>
+                        <w:rPr>
+                          <w:rFonts w:ascii="Consolas" w:hAnsi="Consolas" w:cs="Consolas"/>
+                        </w:rPr>
+                        <w:t>(</w:t>
+                      </w:r>
+                      <w:proofErr w:type="spellStart"/>
+                      <w:proofErr w:type="gramEnd"/>
+                      <w:r>
+                        <w:rPr>
+                          <w:rFonts w:ascii="Consolas" w:hAnsi="Consolas" w:cs="Consolas"/>
+                        </w:rPr>
+                        <w:t>tileX</w:t>
+                      </w:r>
+                      <w:proofErr w:type="spellEnd"/>
+                      <w:r>
+                        <w:rPr>
+                          <w:rFonts w:ascii="Consolas" w:hAnsi="Consolas" w:cs="Consolas"/>
+                        </w:rPr>
+                        <w:t xml:space="preserve">, </w:t>
+                      </w:r>
+                      <w:proofErr w:type="spellStart"/>
+                      <w:r>
+                        <w:rPr>
+                          <w:rFonts w:ascii="Consolas" w:hAnsi="Consolas" w:cs="Consolas"/>
+                        </w:rPr>
+                        <w:t>tileY</w:t>
+                      </w:r>
+                      <w:proofErr w:type="spellEnd"/>
+                      <w:r>
+                        <w:rPr>
+                          <w:rFonts w:ascii="Consolas" w:hAnsi="Consolas" w:cs="Consolas"/>
+                        </w:rPr>
+                        <w:t>)</w:t>
                       </w:r>
                     </w:p>
                     <w:p>
@@ -7339,7 +8200,37 @@
                         <w:rPr>
                           <w:rFonts w:ascii="Consolas" w:hAnsi="Consolas" w:cs="Consolas"/>
                         </w:rPr>
-                        <w:t xml:space="preserve"> world.money - newTurret.cost &gt;= 0</w:t>
+                        <w:t xml:space="preserve"> </w:t>
+                      </w:r>
+                      <w:proofErr w:type="spellStart"/>
+                      <w:proofErr w:type="gramStart"/>
+                      <w:r>
+                        <w:rPr>
+                          <w:rFonts w:ascii="Consolas" w:hAnsi="Consolas" w:cs="Consolas"/>
+                        </w:rPr>
+                        <w:t>world.money</w:t>
+                      </w:r>
+                      <w:proofErr w:type="spellEnd"/>
+                      <w:proofErr w:type="gramEnd"/>
+                      <w:r>
+                        <w:rPr>
+                          <w:rFonts w:ascii="Consolas" w:hAnsi="Consolas" w:cs="Consolas"/>
+                        </w:rPr>
+                        <w:t xml:space="preserve"> - </w:t>
+                      </w:r>
+                      <w:proofErr w:type="spellStart"/>
+                      <w:r>
+                        <w:rPr>
+                          <w:rFonts w:ascii="Consolas" w:hAnsi="Consolas" w:cs="Consolas"/>
+                        </w:rPr>
+                        <w:t>newTurret.cost</w:t>
+                      </w:r>
+                      <w:proofErr w:type="spellEnd"/>
+                      <w:r>
+                        <w:rPr>
+                          <w:rFonts w:ascii="Consolas" w:hAnsi="Consolas" w:cs="Consolas"/>
+                        </w:rPr>
+                        <w:t xml:space="preserve"> &gt;= 0</w:t>
                       </w:r>
                       <w:r>
                         <w:rPr>
@@ -7355,11 +8246,33 @@
                           <w:rFonts w:ascii="Consolas" w:hAnsi="Consolas" w:cs="Consolas"/>
                         </w:rPr>
                       </w:pPr>
-                      <w:r>
-                        <w:rPr>
-                          <w:rFonts w:ascii="Consolas" w:hAnsi="Consolas" w:cs="Consolas"/>
-                        </w:rPr>
-                        <w:t>allTurretsGroup.add(newTurret)</w:t>
+                      <w:proofErr w:type="spellStart"/>
+                      <w:r>
+                        <w:rPr>
+                          <w:rFonts w:ascii="Consolas" w:hAnsi="Consolas" w:cs="Consolas"/>
+                        </w:rPr>
+                        <w:t>allTurretsGroup.add</w:t>
+                      </w:r>
+                      <w:proofErr w:type="spellEnd"/>
+                      <w:r>
+                        <w:rPr>
+                          <w:rFonts w:ascii="Consolas" w:hAnsi="Consolas" w:cs="Consolas"/>
+                        </w:rPr>
+                        <w:t>(</w:t>
+                      </w:r>
+                      <w:proofErr w:type="spellStart"/>
+                      <w:r>
+                        <w:rPr>
+                          <w:rFonts w:ascii="Consolas" w:hAnsi="Consolas" w:cs="Consolas"/>
+                        </w:rPr>
+                        <w:t>newTurret</w:t>
+                      </w:r>
+                      <w:proofErr w:type="spellEnd"/>
+                      <w:r>
+                        <w:rPr>
+                          <w:rFonts w:ascii="Consolas" w:hAnsi="Consolas" w:cs="Consolas"/>
+                        </w:rPr>
+                        <w:t>)</w:t>
                       </w:r>
                     </w:p>
                     <w:p>
@@ -7369,11 +8282,56 @@
                           <w:rFonts w:ascii="Consolas" w:hAnsi="Consolas" w:cs="Consolas"/>
                         </w:rPr>
                       </w:pPr>
-                      <w:r>
-                        <w:rPr>
-                          <w:rFonts w:ascii="Consolas" w:hAnsi="Consolas" w:cs="Consolas"/>
-                        </w:rPr>
-                        <w:t>world.money -= newTurret.cost</w:t>
+                      <w:proofErr w:type="spellStart"/>
+                      <w:proofErr w:type="gramStart"/>
+                      <w:r>
+                        <w:rPr>
+                          <w:rFonts w:ascii="Consolas" w:hAnsi="Consolas" w:cs="Consolas"/>
+                        </w:rPr>
+                        <w:t>world.money</w:t>
+                      </w:r>
+                      <w:proofErr w:type="spellEnd"/>
+                      <w:proofErr w:type="gramEnd"/>
+                      <w:r>
+                        <w:rPr>
+                          <w:rFonts w:ascii="Consolas" w:hAnsi="Consolas" w:cs="Consolas"/>
+                        </w:rPr>
+                        <w:t xml:space="preserve"> -= </w:t>
+                      </w:r>
+                      <w:proofErr w:type="spellStart"/>
+                      <w:r>
+                        <w:rPr>
+                          <w:rFonts w:ascii="Consolas" w:hAnsi="Consolas" w:cs="Consolas"/>
+                        </w:rPr>
+                        <w:t>newTurret.cost</w:t>
+                      </w:r>
+                      <w:proofErr w:type="spellEnd"/>
+                      <w:r>
+                        <w:rPr>
+                          <w:rFonts w:ascii="Consolas" w:hAnsi="Consolas" w:cs="Consolas"/>
+                        </w:rPr>
+                        <w:br/>
+                        <w:t>END IF</w:t>
+                      </w:r>
+                    </w:p>
+                    <w:p>
+                      <w:pPr>
+                        <w:rPr>
+                          <w:rFonts w:ascii="Consolas" w:hAnsi="Consolas" w:cs="Consolas"/>
+                        </w:rPr>
+                      </w:pPr>
+                      <w:r>
+                        <w:rPr>
+                          <w:rFonts w:ascii="Consolas" w:hAnsi="Consolas" w:cs="Consolas"/>
+                        </w:rPr>
+                        <w:tab/>
+                      </w:r>
+                      <w:r>
+                        <w:rPr>
+                          <w:rFonts w:ascii="Consolas" w:hAnsi="Consolas" w:cs="Consolas"/>
+                        </w:rPr>
+                        <w:tab/>
+                        <w:t>END IF</w:t>
                       </w:r>
                     </w:p>
                     <w:p>
@@ -7422,8 +8380,16 @@
                         <w:rPr>
                           <w:rFonts w:ascii="Consolas" w:hAnsi="Consolas" w:cs="Consolas"/>
                         </w:rPr>
-                        <w:t>return allTurretsGroup</w:t>
-                      </w:r>
+                        <w:t xml:space="preserve">return </w:t>
+                      </w:r>
+                      <w:proofErr w:type="spellStart"/>
+                      <w:r>
+                        <w:rPr>
+                          <w:rFonts w:ascii="Consolas" w:hAnsi="Consolas" w:cs="Consolas"/>
+                        </w:rPr>
+                        <w:t>allTurretsGroup</w:t>
+                      </w:r>
+                      <w:proofErr w:type="spellEnd"/>
                     </w:p>
                     <w:p>
                       <w:pPr>
@@ -7437,12 +8403,14 @@
                       <w:r>
                         <w:t xml:space="preserve">END </w:t>
                       </w:r>
+                      <w:proofErr w:type="spellStart"/>
                       <w:r>
                         <w:rPr>
                           <w:rFonts w:ascii="Consolas" w:hAnsi="Consolas" w:cs="Consolas"/>
                         </w:rPr>
                         <w:t>createTurret</w:t>
                       </w:r>
+                      <w:proofErr w:type="spellEnd"/>
                     </w:p>
                   </w:txbxContent>
                 </v:textbox>

</xml_diff>